<commit_message>
data(resultados): reestimação E2 e entregáveis regenerados (04/10/2026)
Números que mudaram com a especificação (A) ≡ M3 (jornada, urbano e UF):
- Oaxaca: retornos 23,4% → 17,9% (A) e 17,3% → 15,4% (B).
- RIF: retornos q10 32,3% → 26,5%, q90 9,1% → 8,9% (razão 3,5 → 3,0).
- QR M3: q10 5,7% → 4,3%, q90 8,7% → 8,4%; teste KB Z = −25,9.
- E-value do acesso 1,76 → 1,46 (√OR para desfecho comum).
Novos: gap_agregado.csv (sem UF 20,1%), hlm_m1_uf.csv (mediação com UF 41,6%),
grupo_rg_por_cbo.csv (mulher negra: dirigentes OR 0,63, administrativo 1,96),
glmm_prevalencias.csv.

Entregáveis regenerados às 11:47 com todos os portões OK (caca_fosseis 0,
conferir_numeros 0, validate consistente, conferência das normas OK);
TCC com 45 páginas e 41 referências.

Co-Authored-By: Claude Opus 5.5 (1M context) <noreply@anthropic.com>
Claude-Session: https://claude.ai/code/session_01ATPBca6o9jxRv5wGBtSSkf
</commit_message>
<xml_diff>
--- a/entregaveis/TCC_Ricardo_Calheiros_Guia_de_Estudo.docx
+++ b/entregaveis/TCC_Ricardo_Calheiros_Guia_de_Estudo.docx
@@ -253,7 +253,7 @@
           <w:i w:val="0"/>
           <w:sz w:val="21"/>
         </w:rPr>
-        <w:t>“Com a mesma escolaridade, idade, sexo e bairro, um trabalhador negro ganha 10,2% a menos que um branco — e a barreira mais dura não é o salário, é a porta: 30% menos chance de chegar a um cargo qualificado. O mercado de trabalho brasileiro não é racialmente neutro, e educação sozinha não corrige isso.”</w:t>
+        <w:t>“Com a mesma escolaridade, idade, sexo e bairro, um trabalhador negro ganha 6,1% a menos e tem chances 19% menores de chegar a um cargo qualificado. O diploma quase iguala o salário, mas não abre a porta.”</w:t>
       </w:r>
     </w:p>
     <w:p>
@@ -289,7 +289,7 @@
           <w:i w:val="0"/>
           <w:sz w:val="22"/>
         </w:rPr>
-        <w:t>19,1% a menos</w:t>
+        <w:t>10,5% a menos</w:t>
       </w:r>
       <w:r>
         <w:rPr>
@@ -343,7 +343,7 @@
           <w:i w:val="0"/>
           <w:sz w:val="22"/>
         </w:rPr>
-        <w:t xml:space="preserve">, ele cai quase à metade: 47,0% do gap agregado é mediado pela segregação residencial, e sobra um </w:t>
+        <w:t xml:space="preserve">, ele encolhe: 39,5% do gap agregado é mediado pela segregação residencial, e sobra um </w:t>
       </w:r>
       <w:r>
         <w:rPr>
@@ -352,7 +352,7 @@
           <w:i w:val="0"/>
           <w:sz w:val="22"/>
         </w:rPr>
-        <w:t>gap líquido de 10,2%</w:t>
+        <w:t>gap líquido de 6,1%</w:t>
       </w:r>
       <w:r>
         <w:rPr>
@@ -361,7 +361,7 @@
           <w:i w:val="0"/>
           <w:sz w:val="22"/>
         </w:rPr>
-        <w:t>. Dentro da mesma ocupação ainda persistem 7,0% — e a ocupação é ela própria resultado da barreira de acesso.</w:t>
+        <w:t>. Dentro da mesma ocupação ainda persistem 5,6% — e a ocupação é ela própria resultado da barreira de acesso.</w:t>
       </w:r>
     </w:p>
     <w:p>
@@ -388,7 +388,7 @@
           <w:i w:val="0"/>
           <w:sz w:val="22"/>
         </w:rPr>
-        <w:t>Quatro métodos independentes sobre a população completa da PNAD Contínua (cerca de 7,7 milhões de observações em 40.969 bairros; o N exato varia com os filtros de cada método):</w:t>
+        <w:t>Quatro métodos independentes sobre a população completa da PNAD Contínua (cerca de 7,7 milhões de observações em 41.454 bairros; o N exato varia com os filtros de cada método):</w:t>
       </w:r>
     </w:p>
     <w:tbl>
@@ -403,11 +403,18 @@
         <w:gridCol w:w="3249"/>
       </w:tblGrid>
       <w:tr>
+        <w:trPr>
+          <w:cantSplit/>
+          <w:tblHeader w:val="true"/>
+        </w:trPr>
         <w:tc>
           <w:tcPr>
             <w:tcW w:type="dxa" w:w="2268"/>
           </w:tcPr>
           <w:p>
+            <w:pPr>
+              <w:keepNext/>
+            </w:pPr>
             <w:r/>
             <w:r>
               <w:rPr>
@@ -425,6 +432,9 @@
             <w:tcW w:type="dxa" w:w="3118"/>
           </w:tcPr>
           <w:p>
+            <w:pPr>
+              <w:keepNext/>
+            </w:pPr>
             <w:r/>
             <w:r>
               <w:rPr>
@@ -442,6 +452,9 @@
             <w:tcW w:type="dxa" w:w="3969"/>
           </w:tcPr>
           <w:p>
+            <w:pPr>
+              <w:keepNext/>
+            </w:pPr>
             <w:r/>
             <w:r>
               <w:rPr>
@@ -456,11 +469,17 @@
         </w:tc>
       </w:tr>
       <w:tr>
+        <w:trPr>
+          <w:cantSplit/>
+        </w:trPr>
         <w:tc>
           <w:tcPr>
             <w:tcW w:type="dxa" w:w="2268"/>
           </w:tcPr>
           <w:p>
+            <w:pPr>
+              <w:keepNext/>
+            </w:pPr>
             <w:r/>
             <w:r>
               <w:rPr>
@@ -478,6 +497,9 @@
             <w:tcW w:type="dxa" w:w="3118"/>
           </w:tcPr>
           <w:p>
+            <w:pPr>
+              <w:keepNext/>
+            </w:pPr>
             <w:r/>
             <w:r>
               <w:rPr>
@@ -495,6 +517,9 @@
             <w:tcW w:type="dxa" w:w="3969"/>
           </w:tcPr>
           <w:p>
+            <w:pPr>
+              <w:keepNext/>
+            </w:pPr>
             <w:r/>
             <w:r>
               <w:rPr>
@@ -503,17 +528,23 @@
                 <w:i w:val="0"/>
                 <w:sz w:val="20"/>
               </w:rPr>
-              <w:t>47,0% mediado pelo bairro; gap líquido 10,2%</w:t>
+              <w:t>39,5% mediado pelo bairro; gap líquido 6,1%</w:t>
             </w:r>
           </w:p>
         </w:tc>
       </w:tr>
       <w:tr>
+        <w:trPr>
+          <w:cantSplit/>
+        </w:trPr>
         <w:tc>
           <w:tcPr>
             <w:tcW w:type="dxa" w:w="2268"/>
           </w:tcPr>
           <w:p>
+            <w:pPr>
+              <w:keepNext/>
+            </w:pPr>
             <w:r/>
             <w:r>
               <w:rPr>
@@ -531,6 +562,9 @@
             <w:tcW w:type="dxa" w:w="3118"/>
           </w:tcPr>
           <w:p>
+            <w:pPr>
+              <w:keepNext/>
+            </w:pPr>
             <w:r/>
             <w:r>
               <w:rPr>
@@ -548,6 +582,9 @@
             <w:tcW w:type="dxa" w:w="3969"/>
           </w:tcPr>
           <w:p>
+            <w:pPr>
+              <w:keepNext/>
+            </w:pPr>
             <w:r/>
             <w:r>
               <w:rPr>
@@ -556,17 +593,23 @@
                 <w:i w:val="0"/>
                 <w:sz w:val="20"/>
               </w:rPr>
-              <w:t>28,4% do gap são retornos diferenciais</w:t>
+              <w:t>17,9% do gap são retornos diferenciais</w:t>
             </w:r>
           </w:p>
         </w:tc>
       </w:tr>
       <w:tr>
+        <w:trPr>
+          <w:cantSplit/>
+        </w:trPr>
         <w:tc>
           <w:tcPr>
             <w:tcW w:type="dxa" w:w="2268"/>
           </w:tcPr>
           <w:p>
+            <w:pPr>
+              <w:keepNext/>
+            </w:pPr>
             <w:r/>
             <w:r>
               <w:rPr>
@@ -584,6 +627,9 @@
             <w:tcW w:type="dxa" w:w="3118"/>
           </w:tcPr>
           <w:p>
+            <w:pPr>
+              <w:keepNext/>
+            </w:pPr>
             <w:r/>
             <w:r>
               <w:rPr>
@@ -601,6 +647,9 @@
             <w:tcW w:type="dxa" w:w="3969"/>
           </w:tcPr>
           <w:p>
+            <w:pPr>
+              <w:keepNext/>
+            </w:pPr>
             <w:r/>
             <w:r>
               <w:rPr>
@@ -609,12 +658,15 @@
                 <w:i w:val="0"/>
                 <w:sz w:val="20"/>
               </w:rPr>
-              <w:t>gap condicional cresce (8,0%→11,6%); retornos maiores na base (35,1% no q10)</w:t>
+              <w:t>gap condicional cresce (4,3%→8,4%); retornos maiores na base (26,5% no q10)</w:t>
             </w:r>
           </w:p>
         </w:tc>
       </w:tr>
       <w:tr>
+        <w:trPr>
+          <w:cantSplit/>
+        </w:trPr>
         <w:tc>
           <w:tcPr>
             <w:tcW w:type="dxa" w:w="2268"/>
@@ -662,7 +714,7 @@
                 <w:i w:val="0"/>
                 <w:sz w:val="20"/>
               </w:rPr>
-              <w:t>OR = 0,699 para cargo qualificado; 0,654 no topo 10%</w:t>
+              <w:t>OR = 0,814 para cargo qualificado; 0,761 no topo 10%</w:t>
             </w:r>
           </w:p>
         </w:tc>
@@ -685,7 +737,7 @@
           <w:i w:val="0"/>
           <w:sz w:val="22"/>
         </w:rPr>
-        <w:t>Um XGBoost com SHAP confirma, sem impor forma funcional, que a raça mantém contribuição própria: 11ª posição entre 29 preditores.</w:t>
+        <w:t>Um XGBoost com SHAP confirma, sem impor forma funcional, que a raça mantém contribuição própria: 14ª posição entre 28 preditores.</w:t>
       </w:r>
     </w:p>
     <w:p>
@@ -712,7 +764,7 @@
           <w:i w:val="0"/>
           <w:sz w:val="22"/>
         </w:rPr>
-        <w:t>Se o gargalo fosse escolaridade, bastaria ampliar o acesso ao ensino. Os resultados dizem outra coisa: as mesmas credenciais rendem menos, e a barreira maior está no acesso à ocupação. Política de educação isolada tem retorno marginal decrescente; é preciso agir simultaneamente sobre acesso (Lei 12.990/2014), sobre a discriminação salarial (Lei 9.029/1995 e Estatuto da Igualdade Racial) e sobre a segregação residencial.</w:t>
+        <w:t>Se o gargalo fosse escolaridade, bastaria ampliar o acesso ao ensino. Os resultados dizem outra coisa: as mesmas credenciais rendem menos, e há uma barreira própria no acesso à ocupação, que o diploma não desfaz. Política de educação isolada tem retorno marginal decrescente; é preciso agir simultaneamente sobre acesso (Lei 15.142/2025, que substituiu a 12.990/2014), sobre a discriminação salarial (Lei 9.029/1995 e Estatuto da Igualdade Racial) e sobre a segregação residencial.</w:t>
       </w:r>
     </w:p>
     <w:p>
@@ -837,7 +889,7 @@
           <w:i w:val="0"/>
           <w:sz w:val="21"/>
         </w:rPr>
-        <w:t>Modelo nulo, ICC, estratégia step-up e a diferença entre REML e ML. No M0 deste trabalho, ICC = 0,369 — 37% da variância do log-rendimento está entre bairros.</w:t>
+        <w:t>Modelo nulo, ICC, estratégia step-up e a diferença entre REML e ML. No M0 deste trabalho, ICC = 0,353 — 35% da variância do log-rendimento está entre bairros.</w:t>
       </w:r>
     </w:p>
     <w:p>
@@ -1009,7 +1061,7 @@
           <w:i w:val="0"/>
           <w:sz w:val="21"/>
         </w:rPr>
-        <w:t>Quanto de confundimento não observado seria preciso para anular o resultado. Aqui, E-value = 2,2 para a barreira de acesso.</w:t>
+        <w:t>Quanto de confundimento não observado seria preciso para anular o resultado. Aqui, E-value = 1,5 para a barreira de acesso.</w:t>
       </w:r>
     </w:p>
     <w:p>
@@ -1041,7 +1093,7 @@
           <w:i w:val="0"/>
           <w:sz w:val="21"/>
         </w:rPr>
-        <w:t>O conceito por trás da decomposição de quatro grupos e da penalidade extra.</w:t>
+        <w:t>O conceito por trás da decomposição de quatro grupos (raça × gênero).</w:t>
       </w:r>
     </w:p>
     <w:p>
@@ -1257,11 +1309,18 @@
         <w:gridCol w:w="1949"/>
       </w:tblGrid>
       <w:tr>
+        <w:trPr>
+          <w:cantSplit/>
+          <w:tblHeader w:val="true"/>
+        </w:trPr>
         <w:tc>
           <w:tcPr>
             <w:tcW w:type="dxa" w:w="1247"/>
           </w:tcPr>
           <w:p>
+            <w:pPr>
+              <w:keepNext/>
+            </w:pPr>
             <w:r/>
             <w:r>
               <w:rPr>
@@ -1279,6 +1338,9 @@
             <w:tcW w:type="dxa" w:w="3175"/>
           </w:tcPr>
           <w:p>
+            <w:pPr>
+              <w:keepNext/>
+            </w:pPr>
             <w:r/>
             <w:r>
               <w:rPr>
@@ -1296,6 +1358,9 @@
             <w:tcW w:type="dxa" w:w="1474"/>
           </w:tcPr>
           <w:p>
+            <w:pPr>
+              <w:keepNext/>
+            </w:pPr>
             <w:r/>
             <w:r>
               <w:rPr>
@@ -1313,6 +1378,9 @@
             <w:tcW w:type="dxa" w:w="1361"/>
           </w:tcPr>
           <w:p>
+            <w:pPr>
+              <w:keepNext/>
+            </w:pPr>
             <w:r/>
             <w:r>
               <w:rPr>
@@ -1330,6 +1398,9 @@
             <w:tcW w:type="dxa" w:w="1814"/>
           </w:tcPr>
           <w:p>
+            <w:pPr>
+              <w:keepNext/>
+            </w:pPr>
             <w:r/>
             <w:r>
               <w:rPr>
@@ -1344,11 +1415,17 @@
         </w:tc>
       </w:tr>
       <w:tr>
+        <w:trPr>
+          <w:cantSplit/>
+        </w:trPr>
         <w:tc>
           <w:tcPr>
             <w:tcW w:type="dxa" w:w="1247"/>
           </w:tcPr>
           <w:p>
+            <w:pPr>
+              <w:keepNext/>
+            </w:pPr>
             <w:r/>
             <w:r>
               <w:rPr>
@@ -1366,6 +1443,9 @@
             <w:tcW w:type="dxa" w:w="3175"/>
           </w:tcPr>
           <w:p>
+            <w:pPr>
+              <w:keepNext/>
+            </w:pPr>
             <w:r/>
             <w:r>
               <w:rPr>
@@ -1383,6 +1463,9 @@
             <w:tcW w:type="dxa" w:w="1474"/>
           </w:tcPr>
           <w:p>
+            <w:pPr>
+              <w:keepNext/>
+            </w:pPr>
             <w:r/>
             <w:r>
               <w:rPr>
@@ -1391,7 +1474,7 @@
                 <w:i w:val="0"/>
                 <w:sz w:val="20"/>
               </w:rPr>
-              <w:t>−0,2123</w:t>
+              <w:t>−0,1104</w:t>
             </w:r>
           </w:p>
         </w:tc>
@@ -1400,6 +1483,9 @@
             <w:tcW w:type="dxa" w:w="1361"/>
           </w:tcPr>
           <w:p>
+            <w:pPr>
+              <w:keepNext/>
+            </w:pPr>
             <w:r/>
             <w:r>
               <w:rPr>
@@ -1408,7 +1494,7 @@
                 <w:i w:val="0"/>
                 <w:sz w:val="20"/>
               </w:rPr>
-              <w:t>−19,1</w:t>
+              <w:t>−10,5</w:t>
             </w:r>
           </w:p>
         </w:tc>
@@ -1417,6 +1503,9 @@
             <w:tcW w:type="dxa" w:w="1814"/>
           </w:tcPr>
           <w:p>
+            <w:pPr>
+              <w:keepNext/>
+            </w:pPr>
             <w:r/>
             <w:r>
               <w:rPr>
@@ -1431,11 +1520,17 @@
         </w:tc>
       </w:tr>
       <w:tr>
+        <w:trPr>
+          <w:cantSplit/>
+        </w:trPr>
         <w:tc>
           <w:tcPr>
             <w:tcW w:type="dxa" w:w="1247"/>
           </w:tcPr>
           <w:p>
+            <w:pPr>
+              <w:keepNext/>
+            </w:pPr>
             <w:r/>
             <w:r>
               <w:rPr>
@@ -1453,6 +1548,9 @@
             <w:tcW w:type="dxa" w:w="3175"/>
           </w:tcPr>
           <w:p>
+            <w:pPr>
+              <w:keepNext/>
+            </w:pPr>
             <w:r/>
             <w:r>
               <w:rPr>
@@ -1470,6 +1568,9 @@
             <w:tcW w:type="dxa" w:w="1474"/>
           </w:tcPr>
           <w:p>
+            <w:pPr>
+              <w:keepNext/>
+            </w:pPr>
             <w:r/>
             <w:r>
               <w:rPr>
@@ -1478,7 +1579,7 @@
                 <w:i w:val="0"/>
                 <w:sz w:val="20"/>
               </w:rPr>
-              <w:t>−0,1124</w:t>
+              <w:t>−0,0669</w:t>
             </w:r>
           </w:p>
         </w:tc>
@@ -1487,6 +1588,9 @@
             <w:tcW w:type="dxa" w:w="1361"/>
           </w:tcPr>
           <w:p>
+            <w:pPr>
+              <w:keepNext/>
+            </w:pPr>
             <w:r/>
             <w:r>
               <w:rPr>
@@ -1495,7 +1599,7 @@
                 <w:i w:val="0"/>
                 <w:sz w:val="20"/>
               </w:rPr>
-              <w:t>−10,6</w:t>
+              <w:t>−6,5</w:t>
             </w:r>
           </w:p>
         </w:tc>
@@ -1504,6 +1608,9 @@
             <w:tcW w:type="dxa" w:w="1814"/>
           </w:tcPr>
           <w:p>
+            <w:pPr>
+              <w:keepNext/>
+            </w:pPr>
             <w:r/>
             <w:r>
               <w:rPr>
@@ -1512,17 +1619,23 @@
                 <w:i w:val="0"/>
                 <w:sz w:val="20"/>
               </w:rPr>
-              <w:t>47,0%</w:t>
+              <w:t>39,5%</w:t>
             </w:r>
           </w:p>
         </w:tc>
       </w:tr>
       <w:tr>
+        <w:trPr>
+          <w:cantSplit/>
+        </w:trPr>
         <w:tc>
           <w:tcPr>
             <w:tcW w:type="dxa" w:w="1247"/>
           </w:tcPr>
           <w:p>
+            <w:pPr>
+              <w:keepNext/>
+            </w:pPr>
             <w:r/>
             <w:r>
               <w:rPr>
@@ -1540,6 +1653,9 @@
             <w:tcW w:type="dxa" w:w="3175"/>
           </w:tcPr>
           <w:p>
+            <w:pPr>
+              <w:keepNext/>
+            </w:pPr>
             <w:r/>
             <w:r>
               <w:rPr>
@@ -1557,6 +1673,9 @@
             <w:tcW w:type="dxa" w:w="1474"/>
           </w:tcPr>
           <w:p>
+            <w:pPr>
+              <w:keepNext/>
+            </w:pPr>
             <w:r/>
             <w:r>
               <w:rPr>
@@ -1565,7 +1684,7 @@
                 <w:i w:val="0"/>
                 <w:sz w:val="20"/>
               </w:rPr>
-              <w:t>−0,1076</w:t>
+              <w:t>−0,0637</w:t>
             </w:r>
           </w:p>
         </w:tc>
@@ -1574,6 +1693,9 @@
             <w:tcW w:type="dxa" w:w="1361"/>
           </w:tcPr>
           <w:p>
+            <w:pPr>
+              <w:keepNext/>
+            </w:pPr>
             <w:r/>
             <w:r>
               <w:rPr>
@@ -1582,7 +1704,7 @@
                 <w:i w:val="0"/>
                 <w:sz w:val="20"/>
               </w:rPr>
-              <w:t>−10,2</w:t>
+              <w:t>−6,2</w:t>
             </w:r>
           </w:p>
         </w:tc>
@@ -1591,6 +1713,9 @@
             <w:tcW w:type="dxa" w:w="1814"/>
           </w:tcPr>
           <w:p>
+            <w:pPr>
+              <w:keepNext/>
+            </w:pPr>
             <w:r/>
             <w:r>
               <w:rPr>
@@ -1599,17 +1724,23 @@
                 <w:i w:val="0"/>
                 <w:sz w:val="20"/>
               </w:rPr>
-              <w:t>49,3%</w:t>
+              <w:t>42,3%</w:t>
             </w:r>
           </w:p>
         </w:tc>
       </w:tr>
       <w:tr>
+        <w:trPr>
+          <w:cantSplit/>
+        </w:trPr>
         <w:tc>
           <w:tcPr>
             <w:tcW w:type="dxa" w:w="1247"/>
           </w:tcPr>
           <w:p>
+            <w:pPr>
+              <w:keepNext/>
+            </w:pPr>
             <w:r/>
             <w:r>
               <w:rPr>
@@ -1627,6 +1758,9 @@
             <w:tcW w:type="dxa" w:w="3175"/>
           </w:tcPr>
           <w:p>
+            <w:pPr>
+              <w:keepNext/>
+            </w:pPr>
             <w:r/>
             <w:r>
               <w:rPr>
@@ -1644,6 +1778,9 @@
             <w:tcW w:type="dxa" w:w="1474"/>
           </w:tcPr>
           <w:p>
+            <w:pPr>
+              <w:keepNext/>
+            </w:pPr>
             <w:r/>
             <w:r>
               <w:rPr>
@@ -1652,7 +1789,7 @@
                 <w:i w:val="0"/>
                 <w:sz w:val="20"/>
               </w:rPr>
-              <w:t>−0,1077</w:t>
+              <w:t>−0,0629</w:t>
             </w:r>
           </w:p>
         </w:tc>
@@ -1661,6 +1798,9 @@
             <w:tcW w:type="dxa" w:w="1361"/>
           </w:tcPr>
           <w:p>
+            <w:pPr>
+              <w:keepNext/>
+            </w:pPr>
             <w:r/>
             <w:r>
               <w:rPr>
@@ -1669,7 +1809,7 @@
                 <w:i w:val="0"/>
                 <w:sz w:val="20"/>
               </w:rPr>
-              <w:t>−10,2</w:t>
+              <w:t>−6,1</w:t>
             </w:r>
           </w:p>
         </w:tc>
@@ -1678,6 +1818,9 @@
             <w:tcW w:type="dxa" w:w="1814"/>
           </w:tcPr>
           <w:p>
+            <w:pPr>
+              <w:keepNext/>
+            </w:pPr>
             <w:r/>
             <w:r>
               <w:rPr>
@@ -1686,12 +1829,15 @@
                 <w:i w:val="0"/>
                 <w:sz w:val="20"/>
               </w:rPr>
-              <w:t>49,3%</w:t>
+              <w:t>43,0%</w:t>
             </w:r>
           </w:p>
         </w:tc>
       </w:tr>
       <w:tr>
+        <w:trPr>
+          <w:cantSplit/>
+        </w:trPr>
         <w:tc>
           <w:tcPr>
             <w:tcW w:type="dxa" w:w="1247"/>
@@ -1739,7 +1885,7 @@
                 <w:i w:val="0"/>
                 <w:sz w:val="20"/>
               </w:rPr>
-              <w:t>−0,0724</w:t>
+              <w:t>−0,0579</w:t>
             </w:r>
           </w:p>
         </w:tc>
@@ -1756,7 +1902,7 @@
                 <w:i w:val="0"/>
                 <w:sz w:val="20"/>
               </w:rPr>
-              <w:t>−7,0</w:t>
+              <w:t>−5,6</w:t>
             </w:r>
           </w:p>
         </w:tc>
@@ -1773,7 +1919,7 @@
                 <w:i w:val="0"/>
                 <w:sz w:val="20"/>
               </w:rPr>
-              <w:t>65,9%</w:t>
+              <w:t>47,6%</w:t>
             </w:r>
           </w:p>
         </w:tc>
@@ -1797,7 +1943,7 @@
           <w:i w:val="0"/>
           <w:sz w:val="22"/>
         </w:rPr>
-        <w:t>Modelo nulo: τ² = 0,3370, σ² = 0,5759 → ICC = 0,369. Traduza: 37% da variância do log-rendimento está entre bairros, não entre pessoas — é o que justifica o multinível.</w:t>
+        <w:t>Modelo nulo: τ² = 0,3018, σ² = 0,5524 → ICC = 0,353. Traduza: 35% da variância do log-rendimento está entre bairros, não entre pessoas — é o que justifica o multinível.</w:t>
       </w:r>
     </w:p>
     <w:p>
@@ -1813,7 +1959,7 @@
           <w:i w:val="0"/>
           <w:sz w:val="22"/>
         </w:rPr>
-        <w:t>Efeito contextual (M2): γ₀₁ = −0,2189 (EP 0,0017) por desvio-padrão da proporção de negros na UPA. Atenção: o regressor é padronizado — não diga “por ponto percentual”.</w:t>
+        <w:t>Efeito contextual (M2): γ₀₁ = −0,1272 (EP 0,0013) por desvio-padrão da proporção de negros na UPA. Atenção: o regressor é padronizado — não diga “por ponto percentual”.</w:t>
       </w:r>
     </w:p>
     <w:p>
@@ -1829,7 +1975,7 @@
           <w:i w:val="0"/>
           <w:sz w:val="22"/>
         </w:rPr>
-        <w:t>Inclinação aleatória (M3_RS): desvio-padrão da inclinação de raça entre bairros = 0,171; LR contra o M3 = 38.657. A penalidade varia entre bairros, e a covariância negativa (−0,0245) diz que ela é maior justamente nos bairros de renda mais alta.</w:t>
+        <w:t>Inclinação aleatória (M3_RS): desvio-padrão da inclinação de raça entre bairros = 0,145; LR contra o M3 = 26.267. A penalidade varia entre bairros, e a covariância negativa (−0,0157) diz que ela é maior justamente nos bairros de renda mais alta.</w:t>
       </w:r>
     </w:p>
     <w:p>
@@ -1845,7 +1991,7 @@
           <w:i w:val="0"/>
           <w:sz w:val="22"/>
         </w:rPr>
-        <w:t>REML vs ML: τ² = 0,33698 por ML e 0,33699 por REML. Com N desse tamanho a escolha é indiferente; usa-se ML porque é o que permite comparar efeitos fixos entre degraus.</w:t>
+        <w:t>REML vs ML: τ² = 0,30182 por ML e 0,30182 por REML. Com N desse tamanho a escolha é indiferente; usa-se ML porque é o que permite comparar efeitos fixos entre degraus.</w:t>
       </w:r>
     </w:p>
     <w:p>
@@ -1900,7 +2046,7 @@
           <w:color w:val="616161"/>
           <w:sz w:val="19"/>
         </w:rPr>
-        <w:t>Metade do gap racial desaparece ao comparar pessoas do mesmo bairro — e o que sobra não é explicado por escolaridade, estado nem ocupação.</w:t>
+        <w:t>Comparar vizinhos reduz o gap em cerca de 40% — e o que sobra não é explicado por escolaridade, estado nem ocupação.</w:t>
       </w:r>
     </w:p>
     <w:p>
@@ -2015,11 +2161,18 @@
         <w:gridCol w:w="1949"/>
       </w:tblGrid>
       <w:tr>
+        <w:trPr>
+          <w:cantSplit/>
+          <w:tblHeader w:val="true"/>
+        </w:trPr>
         <w:tc>
           <w:tcPr>
             <w:tcW w:type="dxa" w:w="3061"/>
           </w:tcPr>
           <w:p>
+            <w:pPr>
+              <w:keepNext/>
+            </w:pPr>
             <w:r/>
             <w:r>
               <w:rPr>
@@ -2037,6 +2190,9 @@
             <w:tcW w:type="dxa" w:w="1361"/>
           </w:tcPr>
           <w:p>
+            <w:pPr>
+              <w:keepNext/>
+            </w:pPr>
             <w:r/>
             <w:r>
               <w:rPr>
@@ -2054,6 +2210,9 @@
             <w:tcW w:type="dxa" w:w="1361"/>
           </w:tcPr>
           <w:p>
+            <w:pPr>
+              <w:keepNext/>
+            </w:pPr>
             <w:r/>
             <w:r>
               <w:rPr>
@@ -2071,6 +2230,9 @@
             <w:tcW w:type="dxa" w:w="1361"/>
           </w:tcPr>
           <w:p>
+            <w:pPr>
+              <w:keepNext/>
+            </w:pPr>
             <w:r/>
             <w:r>
               <w:rPr>
@@ -2088,6 +2250,9 @@
             <w:tcW w:type="dxa" w:w="1928"/>
           </w:tcPr>
           <w:p>
+            <w:pPr>
+              <w:keepNext/>
+            </w:pPr>
             <w:r/>
             <w:r>
               <w:rPr>
@@ -2102,6 +2267,114 @@
         </w:tc>
       </w:tr>
       <w:tr>
+        <w:trPr>
+          <w:cantSplit/>
+        </w:trPr>
+        <w:tc>
+          <w:tcPr>
+            <w:tcW w:type="dxa" w:w="3061"/>
+          </w:tcPr>
+          <w:p>
+            <w:pPr>
+              <w:keepNext/>
+            </w:pPr>
+            <w:r/>
+            <w:r>
+              <w:rPr>
+                <w:rFonts w:ascii="Calibri" w:hAnsi="Calibri"/>
+                <w:b w:val="0"/>
+                <w:i w:val="0"/>
+                <w:sz w:val="20"/>
+              </w:rPr>
+              <w:t>(A) Capital humano + contexto</w:t>
+            </w:r>
+          </w:p>
+        </w:tc>
+        <w:tc>
+          <w:tcPr>
+            <w:tcW w:type="dxa" w:w="1361"/>
+          </w:tcPr>
+          <w:p>
+            <w:pPr>
+              <w:keepNext/>
+            </w:pPr>
+            <w:r/>
+            <w:r>
+              <w:rPr>
+                <w:rFonts w:ascii="Calibri" w:hAnsi="Calibri"/>
+                <w:b w:val="0"/>
+                <w:i w:val="0"/>
+                <w:sz w:val="20"/>
+              </w:rPr>
+              <w:t>53,0%</w:t>
+            </w:r>
+          </w:p>
+        </w:tc>
+        <w:tc>
+          <w:tcPr>
+            <w:tcW w:type="dxa" w:w="1361"/>
+          </w:tcPr>
+          <w:p>
+            <w:pPr>
+              <w:keepNext/>
+            </w:pPr>
+            <w:r/>
+            <w:r>
+              <w:rPr>
+                <w:rFonts w:ascii="Calibri" w:hAnsi="Calibri"/>
+                <w:b w:val="0"/>
+                <w:i w:val="0"/>
+                <w:sz w:val="20"/>
+              </w:rPr>
+              <w:t>82,1%</w:t>
+            </w:r>
+          </w:p>
+        </w:tc>
+        <w:tc>
+          <w:tcPr>
+            <w:tcW w:type="dxa" w:w="1361"/>
+          </w:tcPr>
+          <w:p>
+            <w:pPr>
+              <w:keepNext/>
+            </w:pPr>
+            <w:r/>
+            <w:r>
+              <w:rPr>
+                <w:rFonts w:ascii="Calibri" w:hAnsi="Calibri"/>
+                <w:b w:val="0"/>
+                <w:i w:val="0"/>
+                <w:sz w:val="20"/>
+              </w:rPr>
+              <w:t>17,9%</w:t>
+            </w:r>
+          </w:p>
+        </w:tc>
+        <w:tc>
+          <w:tcPr>
+            <w:tcW w:type="dxa" w:w="1928"/>
+          </w:tcPr>
+          <w:p>
+            <w:pPr>
+              <w:keepNext/>
+            </w:pPr>
+            <w:r/>
+            <w:r>
+              <w:rPr>
+                <w:rFonts w:ascii="Calibri" w:hAnsi="Calibri"/>
+                <w:b w:val="0"/>
+                <w:i w:val="0"/>
+                <w:sz w:val="20"/>
+              </w:rPr>
+              <w:t>comparável à literatura</w:t>
+            </w:r>
+          </w:p>
+        </w:tc>
+      </w:tr>
+      <w:tr>
+        <w:trPr>
+          <w:cantSplit/>
+        </w:trPr>
         <w:tc>
           <w:tcPr>
             <w:tcW w:type="dxa" w:w="3061"/>
@@ -2115,7 +2388,7 @@
                 <w:i w:val="0"/>
                 <w:sz w:val="20"/>
               </w:rPr>
-              <w:t>(A) Capital humano + contexto</w:t>
+              <w:t>(B) + ocupação e formalidade</w:t>
             </w:r>
           </w:p>
         </w:tc>
@@ -2149,7 +2422,7 @@
                 <w:i w:val="0"/>
                 <w:sz w:val="20"/>
               </w:rPr>
-              <w:t>71,6%</w:t>
+              <w:t>84,6%</w:t>
             </w:r>
           </w:p>
         </w:tc>
@@ -2166,94 +2439,7 @@
                 <w:i w:val="0"/>
                 <w:sz w:val="20"/>
               </w:rPr>
-              <w:t>28,4%</w:t>
-            </w:r>
-          </w:p>
-        </w:tc>
-        <w:tc>
-          <w:tcPr>
-            <w:tcW w:type="dxa" w:w="1928"/>
-          </w:tcPr>
-          <w:p>
-            <w:r/>
-            <w:r>
-              <w:rPr>
-                <w:rFonts w:ascii="Calibri" w:hAnsi="Calibri"/>
-                <w:b w:val="0"/>
-                <w:i w:val="0"/>
-                <w:sz w:val="20"/>
-              </w:rPr>
-              <w:t>comparável à literatura</w:t>
-            </w:r>
-          </w:p>
-        </w:tc>
-      </w:tr>
-      <w:tr>
-        <w:tc>
-          <w:tcPr>
-            <w:tcW w:type="dxa" w:w="3061"/>
-          </w:tcPr>
-          <w:p>
-            <w:r/>
-            <w:r>
-              <w:rPr>
-                <w:rFonts w:ascii="Calibri" w:hAnsi="Calibri"/>
-                <w:b w:val="0"/>
-                <w:i w:val="0"/>
-                <w:sz w:val="20"/>
-              </w:rPr>
-              <w:t>(B) + ocupação, formalidade e horas</w:t>
-            </w:r>
-          </w:p>
-        </w:tc>
-        <w:tc>
-          <w:tcPr>
-            <w:tcW w:type="dxa" w:w="1361"/>
-          </w:tcPr>
-          <w:p>
-            <w:r/>
-            <w:r>
-              <w:rPr>
-                <w:rFonts w:ascii="Calibri" w:hAnsi="Calibri"/>
-                <w:b w:val="0"/>
-                <w:i w:val="0"/>
-                <w:sz w:val="20"/>
-              </w:rPr>
-              <w:t>53,0%</w:t>
-            </w:r>
-          </w:p>
-        </w:tc>
-        <w:tc>
-          <w:tcPr>
-            <w:tcW w:type="dxa" w:w="1361"/>
-          </w:tcPr>
-          <w:p>
-            <w:r/>
-            <w:r>
-              <w:rPr>
-                <w:rFonts w:ascii="Calibri" w:hAnsi="Calibri"/>
-                <w:b w:val="0"/>
-                <w:i w:val="0"/>
-                <w:sz w:val="20"/>
-              </w:rPr>
-              <w:t>83,8%</w:t>
-            </w:r>
-          </w:p>
-        </w:tc>
-        <w:tc>
-          <w:tcPr>
-            <w:tcW w:type="dxa" w:w="1361"/>
-          </w:tcPr>
-          <w:p>
-            <w:r/>
-            <w:r>
-              <w:rPr>
-                <w:rFonts w:ascii="Calibri" w:hAnsi="Calibri"/>
-                <w:b w:val="0"/>
-                <w:i w:val="0"/>
-                <w:sz w:val="20"/>
-              </w:rPr>
-              <w:t>16,2%</w:t>
+              <w:t>15,4%</w:t>
             </w:r>
           </w:p>
         </w:tc>
@@ -2294,7 +2480,7 @@
           <w:i w:val="0"/>
           <w:sz w:val="22"/>
         </w:rPr>
-        <w:t>Erros-padrão por bootstrap em blocos de UPA (500 réplicas), N = 7.694.198 em 40.969 UPAs.</w:t>
+        <w:t>Erros-padrão por bootstrap em blocos de UPA (500 réplicas), N = 7.699.278 em 41.459 UPAs.</w:t>
       </w:r>
     </w:p>
     <w:p>
@@ -2365,7 +2551,7 @@
           <w:color w:val="616161"/>
           <w:sz w:val="19"/>
         </w:rPr>
-        <w:t>Tratar a ocupação como “característica” derruba pela metade a discriminação medida — por isso as duas especificações são reportadas lado a lado.</w:t>
+        <w:t>Tratar a ocupação como “característica” reduz a discriminação medida de 17,9% para 15,4% do gap — por isso as duas especificações são reportadas lado a lado.</w:t>
       </w:r>
     </w:p>
     <w:p>
@@ -2423,11 +2609,18 @@
         <w:gridCol w:w="3249"/>
       </w:tblGrid>
       <w:tr>
+        <w:trPr>
+          <w:cantSplit/>
+          <w:tblHeader w:val="true"/>
+        </w:trPr>
         <w:tc>
           <w:tcPr>
             <w:tcW w:type="dxa" w:w="1701"/>
           </w:tcPr>
           <w:p>
+            <w:pPr>
+              <w:keepNext/>
+            </w:pPr>
             <w:r/>
             <w:r>
               <w:rPr>
@@ -2445,6 +2638,9 @@
             <w:tcW w:type="dxa" w:w="3118"/>
           </w:tcPr>
           <w:p>
+            <w:pPr>
+              <w:keepNext/>
+            </w:pPr>
             <w:r/>
             <w:r>
               <w:rPr>
@@ -2462,6 +2658,9 @@
             <w:tcW w:type="dxa" w:w="3402"/>
           </w:tcPr>
           <w:p>
+            <w:pPr>
+              <w:keepNext/>
+            </w:pPr>
             <w:r/>
             <w:r>
               <w:rPr>
@@ -2476,11 +2675,17 @@
         </w:tc>
       </w:tr>
       <w:tr>
+        <w:trPr>
+          <w:cantSplit/>
+        </w:trPr>
         <w:tc>
           <w:tcPr>
             <w:tcW w:type="dxa" w:w="1701"/>
           </w:tcPr>
           <w:p>
+            <w:pPr>
+              <w:keepNext/>
+            </w:pPr>
             <w:r/>
             <w:r>
               <w:rPr>
@@ -2498,6 +2703,9 @@
             <w:tcW w:type="dxa" w:w="3118"/>
           </w:tcPr>
           <w:p>
+            <w:pPr>
+              <w:keepNext/>
+            </w:pPr>
             <w:r/>
             <w:r>
               <w:rPr>
@@ -2506,7 +2714,7 @@
                 <w:i w:val="0"/>
                 <w:sz w:val="20"/>
               </w:rPr>
-              <w:t>−8,0%</w:t>
+              <w:t>−4,3%</w:t>
             </w:r>
           </w:p>
         </w:tc>
@@ -2515,6 +2723,9 @@
             <w:tcW w:type="dxa" w:w="3402"/>
           </w:tcPr>
           <w:p>
+            <w:pPr>
+              <w:keepNext/>
+            </w:pPr>
             <w:r/>
             <w:r>
               <w:rPr>
@@ -2523,17 +2734,23 @@
                 <w:i w:val="0"/>
                 <w:sz w:val="20"/>
               </w:rPr>
-              <w:t>35,1%</w:t>
+              <w:t>26,5%</w:t>
             </w:r>
           </w:p>
         </w:tc>
       </w:tr>
       <w:tr>
+        <w:trPr>
+          <w:cantSplit/>
+        </w:trPr>
         <w:tc>
           <w:tcPr>
             <w:tcW w:type="dxa" w:w="1701"/>
           </w:tcPr>
           <w:p>
+            <w:pPr>
+              <w:keepNext/>
+            </w:pPr>
             <w:r/>
             <w:r>
               <w:rPr>
@@ -2551,6 +2768,9 @@
             <w:tcW w:type="dxa" w:w="3118"/>
           </w:tcPr>
           <w:p>
+            <w:pPr>
+              <w:keepNext/>
+            </w:pPr>
             <w:r/>
             <w:r>
               <w:rPr>
@@ -2559,7 +2779,7 @@
                 <w:i w:val="0"/>
                 <w:sz w:val="20"/>
               </w:rPr>
-              <w:t>−7,1%</w:t>
+              <w:t>−4,3%</w:t>
             </w:r>
           </w:p>
         </w:tc>
@@ -2568,6 +2788,9 @@
             <w:tcW w:type="dxa" w:w="3402"/>
           </w:tcPr>
           <w:p>
+            <w:pPr>
+              <w:keepNext/>
+            </w:pPr>
             <w:r/>
             <w:r>
               <w:rPr>
@@ -2576,17 +2799,23 @@
                 <w:i w:val="0"/>
                 <w:sz w:val="20"/>
               </w:rPr>
-              <w:t>31,2%</w:t>
+              <w:t>22,3%</w:t>
             </w:r>
           </w:p>
         </w:tc>
       </w:tr>
       <w:tr>
+        <w:trPr>
+          <w:cantSplit/>
+        </w:trPr>
         <w:tc>
           <w:tcPr>
             <w:tcW w:type="dxa" w:w="1701"/>
           </w:tcPr>
           <w:p>
+            <w:pPr>
+              <w:keepNext/>
+            </w:pPr>
             <w:r/>
             <w:r>
               <w:rPr>
@@ -2604,6 +2833,9 @@
             <w:tcW w:type="dxa" w:w="3118"/>
           </w:tcPr>
           <w:p>
+            <w:pPr>
+              <w:keepNext/>
+            </w:pPr>
             <w:r/>
             <w:r>
               <w:rPr>
@@ -2612,7 +2844,7 @@
                 <w:i w:val="0"/>
                 <w:sz w:val="20"/>
               </w:rPr>
-              <w:t>−7,8%</w:t>
+              <w:t>−4,9%</w:t>
             </w:r>
           </w:p>
         </w:tc>
@@ -2621,6 +2853,9 @@
             <w:tcW w:type="dxa" w:w="3402"/>
           </w:tcPr>
           <w:p>
+            <w:pPr>
+              <w:keepNext/>
+            </w:pPr>
             <w:r/>
             <w:r>
               <w:rPr>
@@ -2629,17 +2864,23 @@
                 <w:i w:val="0"/>
                 <w:sz w:val="20"/>
               </w:rPr>
-              <w:t>27,3%</w:t>
+              <w:t>20,6%</w:t>
             </w:r>
           </w:p>
         </w:tc>
       </w:tr>
       <w:tr>
+        <w:trPr>
+          <w:cantSplit/>
+        </w:trPr>
         <w:tc>
           <w:tcPr>
             <w:tcW w:type="dxa" w:w="1701"/>
           </w:tcPr>
           <w:p>
+            <w:pPr>
+              <w:keepNext/>
+            </w:pPr>
             <w:r/>
             <w:r>
               <w:rPr>
@@ -2657,6 +2898,9 @@
             <w:tcW w:type="dxa" w:w="3118"/>
           </w:tcPr>
           <w:p>
+            <w:pPr>
+              <w:keepNext/>
+            </w:pPr>
             <w:r/>
             <w:r>
               <w:rPr>
@@ -2665,7 +2909,7 @@
                 <w:i w:val="0"/>
                 <w:sz w:val="20"/>
               </w:rPr>
-              <w:t>−9,9%</w:t>
+              <w:t>−6,5%</w:t>
             </w:r>
           </w:p>
         </w:tc>
@@ -2674,6 +2918,9 @@
             <w:tcW w:type="dxa" w:w="3402"/>
           </w:tcPr>
           <w:p>
+            <w:pPr>
+              <w:keepNext/>
+            </w:pPr>
             <w:r/>
             <w:r>
               <w:rPr>
@@ -2682,12 +2929,15 @@
                 <w:i w:val="0"/>
                 <w:sz w:val="20"/>
               </w:rPr>
-              <w:t>24,5%</w:t>
+              <w:t>16,9%</w:t>
             </w:r>
           </w:p>
         </w:tc>
       </w:tr>
       <w:tr>
+        <w:trPr>
+          <w:cantSplit/>
+        </w:trPr>
         <w:tc>
           <w:tcPr>
             <w:tcW w:type="dxa" w:w="1701"/>
@@ -2718,7 +2968,7 @@
                 <w:i w:val="0"/>
                 <w:sz w:val="20"/>
               </w:rPr>
-              <w:t>−11,6%</w:t>
+              <w:t>−8,4%</w:t>
             </w:r>
           </w:p>
         </w:tc>
@@ -2735,7 +2985,7 @@
                 <w:i w:val="0"/>
                 <w:sz w:val="20"/>
               </w:rPr>
-              <w:t>12,9%</w:t>
+              <w:t>8,9%</w:t>
             </w:r>
           </w:p>
         </w:tc>
@@ -2759,7 +3009,7 @@
           <w:i w:val="0"/>
           <w:sz w:val="22"/>
         </w:rPr>
-        <w:t>Teste de heterogeneidade: diferença q90 − q10 = −0,0403, Z = −16,95, p &lt; 0,001. O erro-padrão vem de bootstrap m-out-of-n em blocos de UPA (1.229 de 40.969 UPAs por réplica, com reescala √(m/G)).</w:t>
+        <w:t>Teste de heterogeneidade: diferença q90 − q10 = −0,0439, Z = −25,87, p &lt; 0,001. O erro-padrão vem de bootstrap m-out-of-n em blocos de UPA (1.243 de 41.459 UPAs por réplica, com reescala √(m/G)).</w:t>
       </w:r>
     </w:p>
     <w:p>
@@ -2816,7 +3066,7 @@
       <w:r>
         <w:drawing>
           <wp:inline xmlns:a="http://schemas.openxmlformats.org/drawingml/2006/main" xmlns:pic="http://schemas.openxmlformats.org/drawingml/2006/picture">
-            <wp:extent cx="5580000" cy="2140898"/>
+            <wp:extent cx="5580000" cy="2017259"/>
             <wp:docPr id="4" name="Picture 4"/>
             <wp:cNvGraphicFramePr>
               <a:graphicFrameLocks noChangeAspect="1"/>
@@ -2837,7 +3087,7 @@
                   <pic:spPr>
                     <a:xfrm>
                       <a:off x="0" y="0"/>
-                      <a:ext cx="5580000" cy="2140898"/>
+                      <a:ext cx="5580000" cy="2017259"/>
                     </a:xfrm>
                     <a:prstGeom prst="rect"/>
                   </pic:spPr>
@@ -2861,7 +3111,7 @@
           <w:color w:val="616161"/>
           <w:sz w:val="19"/>
         </w:rPr>
-        <w:t>Teto de vidro e piso pegajoso são o mesmo fenômeno visto de dois ângulos.</w:t>
+        <w:t>Teto de vidro entre pares (QR, condicional) e piso pegajoso na renda do país (RIF, incondicional): duas perguntas, dois padrões.</w:t>
       </w:r>
     </w:p>
     <w:p>
@@ -2922,11 +3172,18 @@
         <w:gridCol w:w="1624"/>
       </w:tblGrid>
       <w:tr>
+        <w:trPr>
+          <w:cantSplit/>
+          <w:tblHeader w:val="true"/>
+        </w:trPr>
         <w:tc>
           <w:tcPr>
             <w:tcW w:type="dxa" w:w="2835"/>
           </w:tcPr>
           <w:p>
+            <w:pPr>
+              <w:keepNext/>
+            </w:pPr>
             <w:r/>
             <w:r>
               <w:rPr>
@@ -2944,6 +3201,9 @@
             <w:tcW w:type="dxa" w:w="2041"/>
           </w:tcPr>
           <w:p>
+            <w:pPr>
+              <w:keepNext/>
+            </w:pPr>
             <w:r/>
             <w:r>
               <w:rPr>
@@ -2961,6 +3221,9 @@
             <w:tcW w:type="dxa" w:w="1247"/>
           </w:tcPr>
           <w:p>
+            <w:pPr>
+              <w:keepNext/>
+            </w:pPr>
             <w:r/>
             <w:r>
               <w:rPr>
@@ -2978,6 +3241,9 @@
             <w:tcW w:type="dxa" w:w="1020"/>
           </w:tcPr>
           <w:p>
+            <w:pPr>
+              <w:keepNext/>
+            </w:pPr>
             <w:r/>
             <w:r>
               <w:rPr>
@@ -2986,7 +3252,7 @@
                 <w:i w:val="0"/>
                 <w:sz w:val="20"/>
               </w:rPr>
-              <w:t>ICC UPA</w:t>
+              <w:t>ICC UPA (A2)</w:t>
             </w:r>
           </w:p>
         </w:tc>
@@ -2995,6 +3261,9 @@
             <w:tcW w:type="dxa" w:w="907"/>
           </w:tcPr>
           <w:p>
+            <w:pPr>
+              <w:keepNext/>
+            </w:pPr>
             <w:r/>
             <w:r>
               <w:rPr>
@@ -3012,6 +3281,9 @@
             <w:tcW w:type="dxa" w:w="1020"/>
           </w:tcPr>
           <w:p>
+            <w:pPr>
+              <w:keepNext/>
+            </w:pPr>
             <w:r/>
             <w:r>
               <w:rPr>
@@ -3026,11 +3298,17 @@
         </w:tc>
       </w:tr>
       <w:tr>
+        <w:trPr>
+          <w:cantSplit/>
+        </w:trPr>
         <w:tc>
           <w:tcPr>
             <w:tcW w:type="dxa" w:w="2835"/>
           </w:tcPr>
           <w:p>
+            <w:pPr>
+              <w:keepNext/>
+            </w:pPr>
             <w:r/>
             <w:r>
               <w:rPr>
@@ -3048,6 +3326,9 @@
             <w:tcW w:type="dxa" w:w="2041"/>
           </w:tcPr>
           <w:p>
+            <w:pPr>
+              <w:keepNext/>
+            </w:pPr>
             <w:r/>
             <w:r>
               <w:rPr>
@@ -3056,7 +3337,7 @@
                 <w:i w:val="0"/>
                 <w:sz w:val="20"/>
               </w:rPr>
-              <w:t>0,699 (0,696–0,702)</w:t>
+              <w:t>0,814 (0,810–0,818)</w:t>
             </w:r>
           </w:p>
         </w:tc>
@@ -3065,6 +3346,9 @@
             <w:tcW w:type="dxa" w:w="1247"/>
           </w:tcPr>
           <w:p>
+            <w:pPr>
+              <w:keepNext/>
+            </w:pPr>
             <w:r/>
             <w:r>
               <w:rPr>
@@ -3073,7 +3357,7 @@
                 <w:i w:val="0"/>
                 <w:sz w:val="20"/>
               </w:rPr>
-              <w:t>−5,5</w:t>
+              <w:t>−2,6</w:t>
             </w:r>
           </w:p>
         </w:tc>
@@ -3082,6 +3366,9 @@
             <w:tcW w:type="dxa" w:w="1020"/>
           </w:tcPr>
           <w:p>
+            <w:pPr>
+              <w:keepNext/>
+            </w:pPr>
             <w:r/>
             <w:r>
               <w:rPr>
@@ -3090,7 +3377,7 @@
                 <w:i w:val="0"/>
                 <w:sz w:val="20"/>
               </w:rPr>
-              <w:t>0,198</w:t>
+              <w:t>0,054</w:t>
             </w:r>
           </w:p>
         </w:tc>
@@ -3099,6 +3386,9 @@
             <w:tcW w:type="dxa" w:w="907"/>
           </w:tcPr>
           <w:p>
+            <w:pPr>
+              <w:keepNext/>
+            </w:pPr>
             <w:r/>
             <w:r>
               <w:rPr>
@@ -3107,7 +3397,7 @@
                 <w:i w:val="0"/>
                 <w:sz w:val="20"/>
               </w:rPr>
-              <w:t>0,831</w:t>
+              <w:t>0,878</w:t>
             </w:r>
           </w:p>
         </w:tc>
@@ -3116,6 +3406,9 @@
             <w:tcW w:type="dxa" w:w="1020"/>
           </w:tcPr>
           <w:p>
+            <w:pPr>
+              <w:keepNext/>
+            </w:pPr>
             <w:r/>
             <w:r>
               <w:rPr>
@@ -3124,17 +3417,23 @@
                 <w:i w:val="0"/>
                 <w:sz w:val="20"/>
               </w:rPr>
-              <w:t>2,2</w:t>
+              <w:t>1,5</w:t>
             </w:r>
           </w:p>
         </w:tc>
       </w:tr>
       <w:tr>
+        <w:trPr>
+          <w:cantSplit/>
+        </w:trPr>
         <w:tc>
           <w:tcPr>
             <w:tcW w:type="dxa" w:w="2835"/>
           </w:tcPr>
           <w:p>
+            <w:pPr>
+              <w:keepNext/>
+            </w:pPr>
             <w:r/>
             <w:r>
               <w:rPr>
@@ -3152,6 +3451,9 @@
             <w:tcW w:type="dxa" w:w="2041"/>
           </w:tcPr>
           <w:p>
+            <w:pPr>
+              <w:keepNext/>
+            </w:pPr>
             <w:r/>
             <w:r>
               <w:rPr>
@@ -3160,7 +3462,7 @@
                 <w:i w:val="0"/>
                 <w:sz w:val="20"/>
               </w:rPr>
-              <w:t>0,688</w:t>
+              <w:t>0,769</w:t>
             </w:r>
           </w:p>
         </w:tc>
@@ -3169,6 +3471,9 @@
             <w:tcW w:type="dxa" w:w="1247"/>
           </w:tcPr>
           <w:p>
+            <w:pPr>
+              <w:keepNext/>
+            </w:pPr>
             <w:r/>
             <w:r>
               <w:rPr>
@@ -3177,7 +3482,7 @@
                 <w:i w:val="0"/>
                 <w:sz w:val="20"/>
               </w:rPr>
-              <w:t>−4,7</w:t>
+              <w:t>−2,8</w:t>
             </w:r>
           </w:p>
         </w:tc>
@@ -3186,6 +3491,9 @@
             <w:tcW w:type="dxa" w:w="1020"/>
           </w:tcPr>
           <w:p>
+            <w:pPr>
+              <w:keepNext/>
+            </w:pPr>
             <w:r/>
             <w:r>
               <w:rPr>
@@ -3194,7 +3502,7 @@
                 <w:i w:val="0"/>
                 <w:sz w:val="20"/>
               </w:rPr>
-              <w:t>0,281</w:t>
+              <w:t>0,083</w:t>
             </w:r>
           </w:p>
         </w:tc>
@@ -3203,6 +3511,9 @@
             <w:tcW w:type="dxa" w:w="907"/>
           </w:tcPr>
           <w:p>
+            <w:pPr>
+              <w:keepNext/>
+            </w:pPr>
             <w:r/>
             <w:r>
               <w:rPr>
@@ -3211,7 +3522,7 @@
                 <w:i w:val="0"/>
                 <w:sz w:val="20"/>
               </w:rPr>
-              <w:t>0,844</w:t>
+              <w:t>0,872</w:t>
             </w:r>
           </w:p>
         </w:tc>
@@ -3220,6 +3531,9 @@
             <w:tcW w:type="dxa" w:w="1020"/>
           </w:tcPr>
           <w:p>
+            <w:pPr>
+              <w:keepNext/>
+            </w:pPr>
             <w:r/>
             <w:r>
               <w:rPr>
@@ -3228,12 +3542,15 @@
                 <w:i w:val="0"/>
                 <w:sz w:val="20"/>
               </w:rPr>
-              <w:t>2,3</w:t>
+              <w:t>1,5</w:t>
             </w:r>
           </w:p>
         </w:tc>
       </w:tr>
       <w:tr>
+        <w:trPr>
+          <w:cantSplit/>
+        </w:trPr>
         <w:tc>
           <w:tcPr>
             <w:tcW w:type="dxa" w:w="2835"/>
@@ -3264,7 +3581,7 @@
                 <w:i w:val="0"/>
                 <w:sz w:val="20"/>
               </w:rPr>
-              <w:t>0,654</w:t>
+              <w:t>0,761</w:t>
             </w:r>
           </w:p>
         </w:tc>
@@ -3281,7 +3598,7 @@
                 <w:i w:val="0"/>
                 <w:sz w:val="20"/>
               </w:rPr>
-              <w:t>−3,0</w:t>
+              <w:t>−1,7</w:t>
             </w:r>
           </w:p>
         </w:tc>
@@ -3298,7 +3615,7 @@
                 <w:i w:val="0"/>
                 <w:sz w:val="20"/>
               </w:rPr>
-              <w:t>0,350</w:t>
+              <w:t>0,116</w:t>
             </w:r>
           </w:p>
         </w:tc>
@@ -3315,7 +3632,7 @@
                 <w:i w:val="0"/>
                 <w:sz w:val="20"/>
               </w:rPr>
-              <w:t>0,878</w:t>
+              <w:t>0,900</w:t>
             </w:r>
           </w:p>
         </w:tc>
@@ -3332,7 +3649,7 @@
                 <w:i w:val="0"/>
                 <w:sz w:val="20"/>
               </w:rPr>
-              <w:t>2,4</w:t>
+              <w:t>2,0</w:t>
             </w:r>
           </w:p>
         </w:tc>
@@ -3356,7 +3673,7 @@
           <w:i w:val="0"/>
           <w:sz w:val="22"/>
         </w:rPr>
-        <w:t>Leitura em uma frase: a chance de um trabalhador negro ocupar cargo qualificado é 30% menor que a de um branco do mesmo bairro e perfil; no décimo superior da renda, 35% menor. O gradiente (0,699 → 0,688 → 0,654) é o teto de vidro.</w:t>
+        <w:t>Leitura em uma frase: a chance de um trabalhador negro ocupar cargo qualificado é 19% menor que a de um branco do mesmo bairro e perfil; no décimo superior da renda, 24% menor. O gradiente (0,814 → 0,769 → 0,761) é o teto de vidro.</w:t>
       </w:r>
     </w:p>
     <w:p>
@@ -3372,7 +3689,7 @@
           <w:i w:val="0"/>
           <w:sz w:val="22"/>
         </w:rPr>
-        <w:t>Diga “chance” (odds), não “probabilidade”: por isso o AME está ao lado — 5,5 pontos percentuais de probabilidade.</w:t>
+        <w:t>Diga “chance” (odds), não “probabilidade”: por isso o AME está ao lado — 2,6 pontos percentuais de probabilidade.</w:t>
       </w:r>
     </w:p>
     <w:p>
@@ -3388,7 +3705,7 @@
           <w:i w:val="0"/>
           <w:sz w:val="22"/>
         </w:rPr>
-        <w:t>Ajuste: AUC = 0,831 com efeito aleatório contra 0,790 só com efeitos fixos; corte de Youden 0,30 (sensibilidade 0,82, especificidade 0,68). O teste LR contra o logit pooled é 411.007 — o efeito aleatório de bairro não é ornamento.</w:t>
+        <w:t>Ajuste: AUC = 0,878 com efeito aleatório contra 0,870 só com efeitos fixos; corte de Youden 0,30 (sensibilidade 0,79, especificidade 0,79). O teste LR contra o logit pooled é 77.940 — o efeito aleatório de bairro não é ornamento.</w:t>
       </w:r>
     </w:p>
     <w:p>
@@ -3488,7 +3805,7 @@
           <w:i w:val="0"/>
           <w:sz w:val="22"/>
         </w:rPr>
-        <w:t>Konfound (M3): seria preciso que 99,0% da estimativa fosse viés para invalidar a inferência; a correlação parcial exigida do confundidor (ITCV = 0,069) é maior que a de qualquer covariável observada.</w:t>
+        <w:t>Konfound (M3): seria preciso que 98,4% da estimativa fosse viés para invalidar a inferência; a correlação parcial exigida do confundidor (ITCV = 0,043) é maior que a de qualquer covariável observada.</w:t>
       </w:r>
     </w:p>
     <w:p>
@@ -3504,7 +3821,7 @@
           <w:i w:val="0"/>
           <w:sz w:val="22"/>
         </w:rPr>
-        <w:t>E-value (acesso, M2) = 2,2: um confundidor não medido precisaria estar associado a ser negro e ao acesso com OR de pelo menos 2,2 — acima do observado para escolaridade superior.</w:t>
+        <w:t>E-value (acesso, A2) = 1,5: um confundidor não medido precisaria estar associado a ser negro e ao acesso com OR de pelo menos 1,5 (com o desfecho comum, a OR vira razão de risco pela raiz quadrada). É modesto — a escolaridade tem efeito muito maior sobre o acesso —; diga que o E-value mostra a escala do viés necessário, não que o descarta.</w:t>
       </w:r>
     </w:p>
     <w:p>
@@ -3532,7 +3849,7 @@
           <w:i w:val="0"/>
           <w:sz w:val="22"/>
         </w:rPr>
-        <w:t>Das 19 covariáveis comparadas entre brancos e negros, 14 têm d de Cohen abaixo de 0,2 (desequilíbrio pequeno).</w:t>
+        <w:t>Das 18 covariáveis comparadas entre brancos e negros, 9 têm d de Cohen abaixo de 0,2 (desequilíbrio pequeno).</w:t>
       </w:r>
     </w:p>
     <w:p>
@@ -3548,7 +3865,7 @@
           <w:i w:val="0"/>
           <w:sz w:val="22"/>
         </w:rPr>
-        <w:t>O maior desequilíbrio é justamente o bairro (% negro na UPA (z), d = −1,18) — o que reforça a tese, não a enfraquece: a segregação residencial é o desequilíbrio, não um ruído a controlar.</w:t>
+        <w:t>O maior desequilíbrio é justamente o bairro (% negro na UPA (z), d = −1,17) — o que reforça a tese, não a enfraquece: a segregação residencial é o desequilíbrio, não um ruído a controlar.</w:t>
       </w:r>
     </w:p>
     <w:p>
@@ -3576,7 +3893,7 @@
           <w:i w:val="0"/>
           <w:sz w:val="22"/>
         </w:rPr>
-        <w:t>VIF máximo = 22,25 (Educ.: não registrada); 2 de 24 preditores acima de 10, ambos do bloco educacional — colinearidade por construção.</w:t>
+        <w:t>VIF máximo = 2,66 (CBO: Profissionais); nenhum dos 23 preditores acima de 10.</w:t>
       </w:r>
     </w:p>
     <w:p>
@@ -3592,7 +3909,7 @@
           <w:i w:val="0"/>
           <w:sz w:val="22"/>
         </w:rPr>
-        <w:t>O que importa: o VIF de 'negro' é 1,37. A colinearidade infla o erro-padrão dos retornos educacionais, não o do coeficiente de interesse.</w:t>
+        <w:t>O que importa: o VIF de 'negro' é 1,36. A colinearidade infla o erro-padrão dos retornos educacionais, não o do coeficiente de interesse.</w:t>
       </w:r>
     </w:p>
     <w:p>
@@ -3620,11 +3937,18 @@
         <w:gridCol w:w="2436"/>
       </w:tblGrid>
       <w:tr>
+        <w:trPr>
+          <w:cantSplit/>
+          <w:tblHeader w:val="true"/>
+        </w:trPr>
         <w:tc>
           <w:tcPr>
             <w:tcW w:type="dxa" w:w="3402"/>
           </w:tcPr>
           <w:p>
+            <w:pPr>
+              <w:keepNext/>
+            </w:pPr>
             <w:r/>
             <w:r>
               <w:rPr>
@@ -3642,6 +3966,9 @@
             <w:tcW w:type="dxa" w:w="1701"/>
           </w:tcPr>
           <w:p>
+            <w:pPr>
+              <w:keepNext/>
+            </w:pPr>
             <w:r/>
             <w:r>
               <w:rPr>
@@ -3659,6 +3986,9 @@
             <w:tcW w:type="dxa" w:w="1701"/>
           </w:tcPr>
           <w:p>
+            <w:pPr>
+              <w:keepNext/>
+            </w:pPr>
             <w:r/>
             <w:r>
               <w:rPr>
@@ -3676,6 +4006,9 @@
             <w:tcW w:type="dxa" w:w="1984"/>
           </w:tcPr>
           <w:p>
+            <w:pPr>
+              <w:keepNext/>
+            </w:pPr>
             <w:r/>
             <w:r>
               <w:rPr>
@@ -3690,11 +4023,17 @@
         </w:tc>
       </w:tr>
       <w:tr>
+        <w:trPr>
+          <w:cantSplit/>
+        </w:trPr>
         <w:tc>
           <w:tcPr>
             <w:tcW w:type="dxa" w:w="3402"/>
           </w:tcPr>
           <w:p>
+            <w:pPr>
+              <w:keepNext/>
+            </w:pPr>
             <w:r/>
             <w:r>
               <w:rPr>
@@ -3712,6 +4051,9 @@
             <w:tcW w:type="dxa" w:w="1701"/>
           </w:tcPr>
           <w:p>
+            <w:pPr>
+              <w:keepNext/>
+            </w:pPr>
             <w:r/>
             <w:r>
               <w:rPr>
@@ -3720,7 +4062,7 @@
                 <w:i w:val="0"/>
                 <w:sz w:val="20"/>
               </w:rPr>
-              <w:t>0,569</w:t>
+              <w:t>0,589</w:t>
             </w:r>
           </w:p>
         </w:tc>
@@ -3729,6 +4071,9 @@
             <w:tcW w:type="dxa" w:w="1701"/>
           </w:tcPr>
           <w:p>
+            <w:pPr>
+              <w:keepNext/>
+            </w:pPr>
             <w:r/>
             <w:r>
               <w:rPr>
@@ -3737,7 +4082,7 @@
                 <w:i w:val="0"/>
                 <w:sz w:val="20"/>
               </w:rPr>
-              <w:t>0,570</w:t>
+              <w:t>0,589</w:t>
             </w:r>
           </w:p>
         </w:tc>
@@ -3746,6 +4091,9 @@
             <w:tcW w:type="dxa" w:w="1984"/>
           </w:tcPr>
           <w:p>
+            <w:pPr>
+              <w:keepNext/>
+            </w:pPr>
             <w:r/>
             <w:r>
               <w:rPr>
@@ -3754,17 +4102,23 @@
                 <w:i w:val="0"/>
                 <w:sz w:val="20"/>
               </w:rPr>
-              <w:t>0,0015</w:t>
+              <w:t>0,0003</w:t>
             </w:r>
           </w:p>
         </w:tc>
       </w:tr>
       <w:tr>
+        <w:trPr>
+          <w:cantSplit/>
+        </w:trPr>
         <w:tc>
           <w:tcPr>
             <w:tcW w:type="dxa" w:w="3402"/>
           </w:tcPr>
           <w:p>
+            <w:pPr>
+              <w:keepNext/>
+            </w:pPr>
             <w:r/>
             <w:r>
               <w:rPr>
@@ -3782,6 +4136,9 @@
             <w:tcW w:type="dxa" w:w="1701"/>
           </w:tcPr>
           <w:p>
+            <w:pPr>
+              <w:keepNext/>
+            </w:pPr>
             <w:r/>
             <w:r>
               <w:rPr>
@@ -3790,7 +4147,7 @@
                 <w:i w:val="0"/>
                 <w:sz w:val="20"/>
               </w:rPr>
-              <w:t>0,628</w:t>
+              <w:t>0,644</w:t>
             </w:r>
           </w:p>
         </w:tc>
@@ -3799,6 +4156,9 @@
             <w:tcW w:type="dxa" w:w="1701"/>
           </w:tcPr>
           <w:p>
+            <w:pPr>
+              <w:keepNext/>
+            </w:pPr>
             <w:r/>
             <w:r>
               <w:rPr>
@@ -3807,7 +4167,7 @@
                 <w:i w:val="0"/>
                 <w:sz w:val="20"/>
               </w:rPr>
-              <w:t>0,637</w:t>
+              <w:t>0,653</w:t>
             </w:r>
           </w:p>
         </w:tc>
@@ -3816,6 +4176,9 @@
             <w:tcW w:type="dxa" w:w="1984"/>
           </w:tcPr>
           <w:p>
+            <w:pPr>
+              <w:keepNext/>
+            </w:pPr>
             <w:r/>
             <w:r>
               <w:rPr>
@@ -3824,12 +4187,15 @@
                 <w:i w:val="0"/>
                 <w:sz w:val="20"/>
               </w:rPr>
-              <w:t>0,0090</w:t>
+              <w:t>0,0084</w:t>
             </w:r>
           </w:p>
         </w:tc>
       </w:tr>
       <w:tr>
+        <w:trPr>
+          <w:cantSplit/>
+        </w:trPr>
         <w:tc>
           <w:tcPr>
             <w:tcW w:type="dxa" w:w="3402"/>
@@ -3860,7 +4226,7 @@
                 <w:i w:val="0"/>
                 <w:sz w:val="20"/>
               </w:rPr>
-              <w:t>0,598</w:t>
+              <w:t>0,632</w:t>
             </w:r>
           </w:p>
         </w:tc>
@@ -3877,7 +4243,7 @@
                 <w:i w:val="0"/>
                 <w:sz w:val="20"/>
               </w:rPr>
-              <w:t>0,608</w:t>
+              <w:t>0,640</w:t>
             </w:r>
           </w:p>
         </w:tc>
@@ -3894,7 +4260,7 @@
                 <w:i w:val="0"/>
                 <w:sz w:val="20"/>
               </w:rPr>
-              <w:t>0,0092</w:t>
+              <w:t>0,0081</w:t>
             </w:r>
           </w:p>
         </w:tc>
@@ -3918,7 +4284,7 @@
           <w:i w:val="0"/>
           <w:sz w:val="22"/>
         </w:rPr>
-        <w:t>Validação cruzada de 5 folds sobre a população (6.155.355 de treino, 1.538.839 de teste): R² = 0,628 ± 0,0007.</w:t>
+        <w:t>Validação cruzada de 5 folds sobre a população (6.159.418 de treino, 1.539.855 de teste): R² = 0,644 ± 0,0006.</w:t>
       </w:r>
     </w:p>
     <w:p>
@@ -3934,7 +4300,7 @@
           <w:i w:val="0"/>
           <w:sz w:val="22"/>
         </w:rPr>
-        <w:t>A profundidade máxima 10 foi escolhida entre 6 configurações testadas numa partição de validação dentro do treino — a pior delas (profundidade 4) dava R² = 0,603. Diga isso se perguntarem por que 10.</w:t>
+        <w:t>A profundidade máxima 10 foi escolhida entre 6 configurações testadas numa partição de validação dentro do treino — a pior delas (profundidade 4) dava R² = 0,618. Diga isso se perguntarem por que 10.</w:t>
       </w:r>
     </w:p>
     <w:p>
@@ -3950,7 +4316,7 @@
           <w:i w:val="0"/>
           <w:sz w:val="22"/>
         </w:rPr>
-        <w:t>Erro na unidade original: mediana de R$ 538 por mês (37,3% do rendimento), com correção de smearing de Duan (1,178) — porque o modelo prevê log de renda.</w:t>
+        <w:t>Erro na unidade original: mediana de R$ 664 por mês (34,6% do rendimento), com correção de smearing de Duan (1,159) — porque o modelo prevê log de renda.</w:t>
       </w:r>
     </w:p>
     <w:p>
@@ -3966,7 +4332,7 @@
           <w:i w:val="0"/>
           <w:sz w:val="22"/>
         </w:rPr>
-        <w:t>SHAP: a variável racial ocupa a 11ª posição entre 29 preditores no XGBoost (|SHAP| = 0,0314). Sem a renda média do bairro entre as features, a contribuição da raça é 0,0307 — praticamente a mesma: o resultado não depende do preditor de vizinhança.</w:t>
+        <w:t>SHAP: a variável racial ocupa a 14ª posição entre 28 preditores no XGBoost (|SHAP| = 0,0266). Sem a renda média do bairro entre as features, a contribuição da raça é 0,0295 — praticamente a mesma: o resultado não depende do preditor de vizinhança.</w:t>
       </w:r>
     </w:p>
     <w:p>
@@ -3976,7 +4342,7 @@
       <w:r>
         <w:drawing>
           <wp:inline xmlns:a="http://schemas.openxmlformats.org/drawingml/2006/main" xmlns:pic="http://schemas.openxmlformats.org/drawingml/2006/picture">
-            <wp:extent cx="5040000" cy="3966844"/>
+            <wp:extent cx="5040000" cy="3926335"/>
             <wp:docPr id="6" name="Picture 6"/>
             <wp:cNvGraphicFramePr>
               <a:graphicFrameLocks noChangeAspect="1"/>
@@ -3997,7 +4363,7 @@
                   <pic:spPr>
                     <a:xfrm>
                       <a:off x="0" y="0"/>
-                      <a:ext cx="5040000" cy="3966844"/>
+                      <a:ext cx="5040000" cy="3926335"/>
                     </a:xfrm>
                     <a:prstGeom prst="rect"/>
                   </pic:spPr>
@@ -4021,7 +4387,7 @@
           <w:color w:val="616161"/>
           <w:sz w:val="19"/>
         </w:rPr>
-        <w:t>Contexto do bairro e jornada dominam a previsão de renda; a raça aparece na 11ª posição entre 29 preditores.</w:t>
+        <w:t>Contexto do bairro, diploma superior e jornada dominam a previsão de renda; a raça aparece na 14ª posição entre 28 preditores.</w:t>
       </w:r>
     </w:p>
     <w:p>
@@ -4050,11 +4416,18 @@
         <w:gridCol w:w="1949"/>
       </w:tblGrid>
       <w:tr>
+        <w:trPr>
+          <w:cantSplit/>
+          <w:tblHeader w:val="true"/>
+        </w:trPr>
         <w:tc>
           <w:tcPr>
             <w:tcW w:type="dxa" w:w="2041"/>
           </w:tcPr>
           <w:p>
+            <w:pPr>
+              <w:keepNext/>
+            </w:pPr>
             <w:r/>
             <w:r>
               <w:rPr>
@@ -4072,6 +4445,9 @@
             <w:tcW w:type="dxa" w:w="2041"/>
           </w:tcPr>
           <w:p>
+            <w:pPr>
+              <w:keepNext/>
+            </w:pPr>
             <w:r/>
             <w:r>
               <w:rPr>
@@ -4089,6 +4465,9 @@
             <w:tcW w:type="dxa" w:w="1474"/>
           </w:tcPr>
           <w:p>
+            <w:pPr>
+              <w:keepNext/>
+            </w:pPr>
             <w:r/>
             <w:r>
               <w:rPr>
@@ -4106,6 +4485,9 @@
             <w:tcW w:type="dxa" w:w="1474"/>
           </w:tcPr>
           <w:p>
+            <w:pPr>
+              <w:keepNext/>
+            </w:pPr>
             <w:r/>
             <w:r>
               <w:rPr>
@@ -4123,6 +4505,9 @@
             <w:tcW w:type="dxa" w:w="1814"/>
           </w:tcPr>
           <w:p>
+            <w:pPr>
+              <w:keepNext/>
+            </w:pPr>
             <w:r/>
             <w:r>
               <w:rPr>
@@ -4137,11 +4522,17 @@
         </w:tc>
       </w:tr>
       <w:tr>
+        <w:trPr>
+          <w:cantSplit/>
+        </w:trPr>
         <w:tc>
           <w:tcPr>
             <w:tcW w:type="dxa" w:w="2041"/>
           </w:tcPr>
           <w:p>
+            <w:pPr>
+              <w:keepNext/>
+            </w:pPr>
             <w:r/>
             <w:r>
               <w:rPr>
@@ -4159,6 +4550,9 @@
             <w:tcW w:type="dxa" w:w="2041"/>
           </w:tcPr>
           <w:p>
+            <w:pPr>
+              <w:keepNext/>
+            </w:pPr>
             <w:r/>
             <w:r>
               <w:rPr>
@@ -4167,7 +4561,7 @@
                 <w:i w:val="0"/>
                 <w:sz w:val="20"/>
               </w:rPr>
-              <w:t>19,7%</w:t>
+              <w:t>19,9%</w:t>
             </w:r>
           </w:p>
         </w:tc>
@@ -4176,6 +4570,9 @@
             <w:tcW w:type="dxa" w:w="1474"/>
           </w:tcPr>
           <w:p>
+            <w:pPr>
+              <w:keepNext/>
+            </w:pPr>
             <w:r/>
             <w:r>
               <w:rPr>
@@ -4184,7 +4581,7 @@
                 <w:i w:val="0"/>
                 <w:sz w:val="20"/>
               </w:rPr>
-              <w:t>−51,9%</w:t>
+              <w:t>−97,0%</w:t>
             </w:r>
           </w:p>
         </w:tc>
@@ -4193,6 +4590,9 @@
             <w:tcW w:type="dxa" w:w="1474"/>
           </w:tcPr>
           <w:p>
+            <w:pPr>
+              <w:keepNext/>
+            </w:pPr>
             <w:r/>
             <w:r>
               <w:rPr>
@@ -4201,7 +4601,7 @@
                 <w:i w:val="0"/>
                 <w:sz w:val="20"/>
               </w:rPr>
-              <w:t>151,9%</w:t>
+              <w:t>197,0%</w:t>
             </w:r>
           </w:p>
         </w:tc>
@@ -4210,6 +4610,9 @@
             <w:tcW w:type="dxa" w:w="1814"/>
           </w:tcPr>
           <w:p>
+            <w:pPr>
+              <w:keepNext/>
+            </w:pPr>
             <w:r/>
             <w:r>
               <w:rPr>
@@ -4218,17 +4621,23 @@
                 <w:i w:val="0"/>
                 <w:sz w:val="20"/>
               </w:rPr>
-              <w:t>1.423.994</w:t>
+              <w:t>1.429.355</w:t>
             </w:r>
           </w:p>
         </w:tc>
       </w:tr>
       <w:tr>
+        <w:trPr>
+          <w:cantSplit/>
+        </w:trPr>
         <w:tc>
           <w:tcPr>
             <w:tcW w:type="dxa" w:w="2041"/>
           </w:tcPr>
           <w:p>
+            <w:pPr>
+              <w:keepNext/>
+            </w:pPr>
             <w:r/>
             <w:r>
               <w:rPr>
@@ -4246,6 +4655,9 @@
             <w:tcW w:type="dxa" w:w="2041"/>
           </w:tcPr>
           <w:p>
+            <w:pPr>
+              <w:keepNext/>
+            </w:pPr>
             <w:r/>
             <w:r>
               <w:rPr>
@@ -4254,7 +4666,7 @@
                 <w:i w:val="0"/>
                 <w:sz w:val="20"/>
               </w:rPr>
-              <w:t>56,3%</w:t>
+              <w:t>56,4%</w:t>
             </w:r>
           </w:p>
         </w:tc>
@@ -4263,6 +4675,9 @@
             <w:tcW w:type="dxa" w:w="1474"/>
           </w:tcPr>
           <w:p>
+            <w:pPr>
+              <w:keepNext/>
+            </w:pPr>
             <w:r/>
             <w:r>
               <w:rPr>
@@ -4271,7 +4686,7 @@
                 <w:i w:val="0"/>
                 <w:sz w:val="20"/>
               </w:rPr>
-              <w:t>73,9%</w:t>
+              <w:t>77,2%</w:t>
             </w:r>
           </w:p>
         </w:tc>
@@ -4280,6 +4695,9 @@
             <w:tcW w:type="dxa" w:w="1474"/>
           </w:tcPr>
           <w:p>
+            <w:pPr>
+              <w:keepNext/>
+            </w:pPr>
             <w:r/>
             <w:r>
               <w:rPr>
@@ -4288,7 +4706,7 @@
                 <w:i w:val="0"/>
                 <w:sz w:val="20"/>
               </w:rPr>
-              <w:t>26,1%</w:t>
+              <w:t>22,8%</w:t>
             </w:r>
           </w:p>
         </w:tc>
@@ -4297,6 +4715,9 @@
             <w:tcW w:type="dxa" w:w="1814"/>
           </w:tcPr>
           <w:p>
+            <w:pPr>
+              <w:keepNext/>
+            </w:pPr>
             <w:r/>
             <w:r>
               <w:rPr>
@@ -4305,12 +4726,15 @@
                 <w:i w:val="0"/>
                 <w:sz w:val="20"/>
               </w:rPr>
-              <w:t>2.664.739</w:t>
+              <w:t>2.662.039</w:t>
             </w:r>
           </w:p>
         </w:tc>
       </w:tr>
       <w:tr>
+        <w:trPr>
+          <w:cantSplit/>
+        </w:trPr>
         <w:tc>
           <w:tcPr>
             <w:tcW w:type="dxa" w:w="2041"/>
@@ -4341,7 +4765,7 @@
                 <w:i w:val="0"/>
                 <w:sz w:val="20"/>
               </w:rPr>
-              <w:t>80,6%</w:t>
+              <w:t>80,7%</w:t>
             </w:r>
           </w:p>
         </w:tc>
@@ -4358,7 +4782,7 @@
                 <w:i w:val="0"/>
                 <w:sz w:val="20"/>
               </w:rPr>
-              <w:t>35,3%</w:t>
+              <w:t>27,4%</w:t>
             </w:r>
           </w:p>
         </w:tc>
@@ -4375,7 +4799,7 @@
                 <w:i w:val="0"/>
                 <w:sz w:val="20"/>
               </w:rPr>
-              <w:t>64,7%</w:t>
+              <w:t>72,6%</w:t>
             </w:r>
           </w:p>
         </w:tc>
@@ -4392,7 +4816,7 @@
                 <w:i w:val="0"/>
                 <w:sz w:val="20"/>
               </w:rPr>
-              <w:t>1.769.943</w:t>
+              <w:t>1.765.796</w:t>
             </w:r>
           </w:p>
         </w:tc>
@@ -4416,7 +4840,7 @@
           <w:i w:val="0"/>
           <w:sz w:val="22"/>
         </w:rPr>
-        <w:t>Penalidade extra da mulher negra: 4,6 pontos percentuais além da soma das penalidades de raça e de gênero isoladas — o efeito interseccional puro (Crenshaw, 1989).</w:t>
+        <w:t>A mulher negra teve o maior gap (80,7% contra o homem branco), mas suas desvantagens de raça e de gênero se acumularam sem se multiplicar: em log-pontos, o gap dela (0,592) ficou abaixo da soma das penalidades isoladas (0,629). Somar os percentuais (80,7 contra 19,9 + 56,4) daria a impressão contrária: a escala percentual é convexa, e só a de log-pontos é aditiva.</w:t>
       </w:r>
     </w:p>
     <w:p>
@@ -4437,12 +4861,28 @@
     </w:p>
     <w:p>
       <w:pPr>
+        <w:pStyle w:val="ListBullet"/>
+        <w:spacing w:after="60"/>
+        <w:ind w:left="340"/>
+      </w:pPr>
+      <w:r>
+        <w:rPr>
+          <w:rFonts w:ascii="Calibri" w:hAnsi="Calibri"/>
+          <w:b w:val="0"/>
+          <w:i w:val="0"/>
+          <w:sz w:val="22"/>
+        </w:rPr>
+        <w:t>A aparente vantagem da mulher negra no acesso a cargos CBO 1–4 é composição: vem do apoio administrativo (OR 1,96) e das profissões de nível superior, sobretudo ensino e saúde (OR 1,36), ocupações feminizadas em que a mulher branca entra ainda mais (2,20 e 1,42). Entre os dirigentes, onde se exerce comando, a mulher negra tem a menor chance de todos os grupos (OR 0,63).</w:t>
+      </w:r>
+    </w:p>
+    <w:p>
+      <w:pPr>
         <w:jc w:val="center"/>
       </w:pPr>
       <w:r>
         <w:drawing>
           <wp:inline xmlns:a="http://schemas.openxmlformats.org/drawingml/2006/main" xmlns:pic="http://schemas.openxmlformats.org/drawingml/2006/picture">
-            <wp:extent cx="4680000" cy="3094679"/>
+            <wp:extent cx="5580000" cy="2146154"/>
             <wp:docPr id="7" name="Picture 7"/>
             <wp:cNvGraphicFramePr>
               <a:graphicFrameLocks noChangeAspect="1"/>
@@ -4463,7 +4903,7 @@
                   <pic:spPr>
                     <a:xfrm>
                       <a:off x="0" y="0"/>
-                      <a:ext cx="4680000" cy="3094679"/>
+                      <a:ext cx="5580000" cy="2146154"/>
                     </a:xfrm>
                     <a:prstGeom prst="rect"/>
                   </pic:spPr>
@@ -4487,7 +4927,7 @@
           <w:color w:val="616161"/>
           <w:sz w:val="19"/>
         </w:rPr>
-        <w:t>A mulher negra entra na categoria, mas não chega ao topo.</w:t>
+        <w:t>A mulher negra entra pelas ocupações feminizadas, mas não chega ao comando nem ao topo.</w:t>
       </w:r>
     </w:p>
     <w:p>
@@ -4594,7 +5034,7 @@
           <w:i w:val="0"/>
           <w:sz w:val="22"/>
         </w:rPr>
-        <w:t>ICC = τ² / (τ² + σ²) = 0,3370 / (0,3370 + 0,5759) = 0,369</w:t>
+        <w:t>ICC = τ² / (τ² + σ²) = 0,3018 / (0,3018 + 0,5524) = 0,353</w:t>
       </w:r>
     </w:p>
     <w:p>
@@ -4611,9 +5051,8 @@
     </w:p>
     <w:p>
       <w:pPr>
-        <w:spacing w:before="0" w:after="40"/>
+        <w:spacing w:after="40"/>
         <w:ind w:left="454"/>
-        <w:jc w:val="both"/>
       </w:pPr>
       <w:r>
         <w:rPr>
@@ -4622,24 +5061,288 @@
           <w:i w:val="0"/>
           <w:sz w:val="22"/>
         </w:rPr>
-        <w:t>ln(W̄_B) − ln(W̄_N) = (X̄_B − X̄_N)′β̂_B  +  X̄_N′(β̂_B − β̂_N)</w:t>
+        <w:t>ln(W̄</w:t>
       </w:r>
-    </w:p>
-    <w:p>
-      <w:pPr>
-        <w:spacing w:before="0" w:after="120"/>
-        <w:ind w:left="454"/>
-        <w:jc w:val="both"/>
-      </w:pPr>
       <w:r>
         <w:rPr>
           <w:rFonts w:ascii="Calibri" w:hAnsi="Calibri"/>
           <w:b w:val="0"/>
           <w:i w:val="0"/>
-          <w:color w:val="616161"/>
+          <w:sz w:val="22"/>
+          <w:vertAlign w:val="subscript"/>
+        </w:rPr>
+        <w:t>B</w:t>
+      </w:r>
+      <w:r>
+        <w:rPr>
+          <w:rFonts w:ascii="Calibri" w:hAnsi="Calibri"/>
+          <w:b w:val="0"/>
+          <w:i w:val="0"/>
+          <w:sz w:val="22"/>
+        </w:rPr>
+        <w:t>) − ln(W̄</w:t>
+      </w:r>
+      <w:r>
+        <w:rPr>
+          <w:rFonts w:ascii="Calibri" w:hAnsi="Calibri"/>
+          <w:b w:val="0"/>
+          <w:i w:val="0"/>
+          <w:sz w:val="22"/>
+          <w:vertAlign w:val="subscript"/>
+        </w:rPr>
+        <w:t>N</w:t>
+      </w:r>
+      <w:r>
+        <w:rPr>
+          <w:rFonts w:ascii="Calibri" w:hAnsi="Calibri"/>
+          <w:b w:val="0"/>
+          <w:i w:val="0"/>
+          <w:sz w:val="22"/>
+        </w:rPr>
+        <w:t>) = (X̄</w:t>
+      </w:r>
+      <w:r>
+        <w:rPr>
+          <w:rFonts w:ascii="Calibri" w:hAnsi="Calibri"/>
+          <w:b w:val="0"/>
+          <w:i w:val="0"/>
+          <w:sz w:val="22"/>
+          <w:vertAlign w:val="subscript"/>
+        </w:rPr>
+        <w:t>B</w:t>
+      </w:r>
+      <w:r>
+        <w:rPr>
+          <w:rFonts w:ascii="Calibri" w:hAnsi="Calibri"/>
+          <w:b w:val="0"/>
+          <w:i w:val="0"/>
+          <w:sz w:val="22"/>
+        </w:rPr>
+        <w:t xml:space="preserve"> − X̄</w:t>
+      </w:r>
+      <w:r>
+        <w:rPr>
+          <w:rFonts w:ascii="Calibri" w:hAnsi="Calibri"/>
+          <w:b w:val="0"/>
+          <w:i w:val="0"/>
+          <w:sz w:val="22"/>
+          <w:vertAlign w:val="subscript"/>
+        </w:rPr>
+        <w:t>N</w:t>
+      </w:r>
+      <w:r>
+        <w:rPr>
+          <w:rFonts w:ascii="Calibri" w:hAnsi="Calibri"/>
+          <w:b w:val="0"/>
+          <w:i w:val="0"/>
+          <w:sz w:val="22"/>
+        </w:rPr>
+        <w:t>)′β̂</w:t>
+      </w:r>
+      <w:r>
+        <w:rPr>
+          <w:rFonts w:ascii="Calibri" w:hAnsi="Calibri"/>
+          <w:b w:val="0"/>
+          <w:i w:val="0"/>
+          <w:sz w:val="22"/>
+          <w:vertAlign w:val="subscript"/>
+        </w:rPr>
+        <w:t>B</w:t>
+      </w:r>
+      <w:r>
+        <w:rPr>
+          <w:rFonts w:ascii="Calibri" w:hAnsi="Calibri"/>
+          <w:b w:val="0"/>
+          <w:i w:val="0"/>
+          <w:sz w:val="22"/>
+        </w:rPr>
+        <w:t xml:space="preserve">  +  X̄</w:t>
+      </w:r>
+      <w:r>
+        <w:rPr>
+          <w:rFonts w:ascii="Calibri" w:hAnsi="Calibri"/>
+          <w:b w:val="0"/>
+          <w:i w:val="0"/>
+          <w:sz w:val="22"/>
+          <w:vertAlign w:val="subscript"/>
+        </w:rPr>
+        <w:t>N</w:t>
+      </w:r>
+      <w:r>
+        <w:rPr>
+          <w:rFonts w:ascii="Calibri" w:hAnsi="Calibri"/>
+          <w:b w:val="0"/>
+          <w:i w:val="0"/>
+          <w:sz w:val="22"/>
+        </w:rPr>
+        <w:t>′(β̂</w:t>
+      </w:r>
+      <w:r>
+        <w:rPr>
+          <w:rFonts w:ascii="Calibri" w:hAnsi="Calibri"/>
+          <w:b w:val="0"/>
+          <w:i w:val="0"/>
+          <w:sz w:val="22"/>
+          <w:vertAlign w:val="subscript"/>
+        </w:rPr>
+        <w:t>B</w:t>
+      </w:r>
+      <w:r>
+        <w:rPr>
+          <w:rFonts w:ascii="Calibri" w:hAnsi="Calibri"/>
+          <w:b w:val="0"/>
+          <w:i w:val="0"/>
+          <w:sz w:val="22"/>
+        </w:rPr>
+        <w:t xml:space="preserve"> − β̂</w:t>
+      </w:r>
+      <w:r>
+        <w:rPr>
+          <w:rFonts w:ascii="Calibri" w:hAnsi="Calibri"/>
+          <w:b w:val="0"/>
+          <w:i w:val="0"/>
+          <w:sz w:val="22"/>
+          <w:vertAlign w:val="subscript"/>
+        </w:rPr>
+        <w:t>N</w:t>
+      </w:r>
+      <w:r>
+        <w:rPr>
+          <w:rFonts w:ascii="Calibri" w:hAnsi="Calibri"/>
+          <w:b w:val="0"/>
+          <w:i w:val="0"/>
+          <w:sz w:val="22"/>
+        </w:rPr>
+        <w:t>)</w:t>
+      </w:r>
+    </w:p>
+    <w:p>
+      <w:pPr>
+        <w:spacing w:after="80"/>
+        <w:ind w:left="454"/>
+      </w:pPr>
+      <w:r>
+        <w:rPr>
+          <w:rFonts w:ascii="Calibri" w:hAnsi="Calibri"/>
+          <w:b w:val="0"/>
+          <w:i w:val="0"/>
           <w:sz w:val="20"/>
         </w:rPr>
-        <w:t xml:space="preserve">                      └── dotações ──┘   └──── retornos ────┘</w:t>
+        <w:t>dotações: (X̄</w:t>
+      </w:r>
+      <w:r>
+        <w:rPr>
+          <w:rFonts w:ascii="Calibri" w:hAnsi="Calibri"/>
+          <w:b w:val="0"/>
+          <w:i w:val="0"/>
+          <w:sz w:val="20"/>
+          <w:vertAlign w:val="subscript"/>
+        </w:rPr>
+        <w:t>B</w:t>
+      </w:r>
+      <w:r>
+        <w:rPr>
+          <w:rFonts w:ascii="Calibri" w:hAnsi="Calibri"/>
+          <w:b w:val="0"/>
+          <w:i w:val="0"/>
+          <w:sz w:val="20"/>
+        </w:rPr>
+        <w:t xml:space="preserve"> − X̄</w:t>
+      </w:r>
+      <w:r>
+        <w:rPr>
+          <w:rFonts w:ascii="Calibri" w:hAnsi="Calibri"/>
+          <w:b w:val="0"/>
+          <w:i w:val="0"/>
+          <w:sz w:val="20"/>
+          <w:vertAlign w:val="subscript"/>
+        </w:rPr>
+        <w:t>N</w:t>
+      </w:r>
+      <w:r>
+        <w:rPr>
+          <w:rFonts w:ascii="Calibri" w:hAnsi="Calibri"/>
+          <w:b w:val="0"/>
+          <w:i w:val="0"/>
+          <w:sz w:val="20"/>
+        </w:rPr>
+        <w:t>)′β̂</w:t>
+      </w:r>
+      <w:r>
+        <w:rPr>
+          <w:rFonts w:ascii="Calibri" w:hAnsi="Calibri"/>
+          <w:b w:val="0"/>
+          <w:i w:val="0"/>
+          <w:sz w:val="20"/>
+          <w:vertAlign w:val="subscript"/>
+        </w:rPr>
+        <w:t>B</w:t>
+      </w:r>
+      <w:r>
+        <w:rPr>
+          <w:rFonts w:ascii="Calibri" w:hAnsi="Calibri"/>
+          <w:b w:val="0"/>
+          <w:i w:val="0"/>
+          <w:sz w:val="20"/>
+        </w:rPr>
+        <w:t xml:space="preserve">   ·   retornos: X̄</w:t>
+      </w:r>
+      <w:r>
+        <w:rPr>
+          <w:rFonts w:ascii="Calibri" w:hAnsi="Calibri"/>
+          <w:b w:val="0"/>
+          <w:i w:val="0"/>
+          <w:sz w:val="20"/>
+          <w:vertAlign w:val="subscript"/>
+        </w:rPr>
+        <w:t>N</w:t>
+      </w:r>
+      <w:r>
+        <w:rPr>
+          <w:rFonts w:ascii="Calibri" w:hAnsi="Calibri"/>
+          <w:b w:val="0"/>
+          <w:i w:val="0"/>
+          <w:sz w:val="20"/>
+        </w:rPr>
+        <w:t>′(β̂</w:t>
+      </w:r>
+      <w:r>
+        <w:rPr>
+          <w:rFonts w:ascii="Calibri" w:hAnsi="Calibri"/>
+          <w:b w:val="0"/>
+          <w:i w:val="0"/>
+          <w:sz w:val="20"/>
+          <w:vertAlign w:val="subscript"/>
+        </w:rPr>
+        <w:t>B</w:t>
+      </w:r>
+      <w:r>
+        <w:rPr>
+          <w:rFonts w:ascii="Calibri" w:hAnsi="Calibri"/>
+          <w:b w:val="0"/>
+          <w:i w:val="0"/>
+          <w:sz w:val="20"/>
+        </w:rPr>
+        <w:t xml:space="preserve"> − β̂</w:t>
+      </w:r>
+      <w:r>
+        <w:rPr>
+          <w:rFonts w:ascii="Calibri" w:hAnsi="Calibri"/>
+          <w:b w:val="0"/>
+          <w:i w:val="0"/>
+          <w:sz w:val="20"/>
+          <w:vertAlign w:val="subscript"/>
+        </w:rPr>
+        <w:t>N</w:t>
+      </w:r>
+      <w:r>
+        <w:rPr>
+          <w:rFonts w:ascii="Calibri" w:hAnsi="Calibri"/>
+          <w:b w:val="0"/>
+          <w:i w:val="0"/>
+          <w:sz w:val="20"/>
+        </w:rPr>
+        <w:t>)</w:t>
       </w:r>
     </w:p>
     <w:p>
@@ -4683,7 +5386,7 @@
           <w:i w:val="0"/>
           <w:sz w:val="22"/>
         </w:rPr>
-        <w:t>ICC = τ² / (τ² + π²/3);  OR = exp(β₁) = 0,699</w:t>
+        <w:t>ICC = τ² / (τ² + π²/3);  OR = exp(β₁) = 0,814</w:t>
       </w:r>
     </w:p>
     <w:p>
@@ -4716,6 +5419,22 @@
     </w:p>
     <w:p>
       <w:pPr>
+        <w:spacing w:before="0" w:after="40"/>
+        <w:ind w:left="454"/>
+        <w:jc w:val="both"/>
+      </w:pPr>
+      <w:r>
+        <w:rPr>
+          <w:rFonts w:ascii="Calibri" w:hAnsi="Calibri"/>
+          <w:b w:val="0"/>
+          <w:i w:val="0"/>
+          <w:sz w:val="22"/>
+        </w:rPr>
+        <w:t>Desfecho comum (prevalência ≥ 15%, como o acesso): RR ≈ √(1/OR) antes da fórmula.</w:t>
+      </w:r>
+    </w:p>
+    <w:p>
+      <w:pPr>
         <w:spacing w:before="0" w:after="120"/>
         <w:ind w:left="454"/>
         <w:jc w:val="both"/>
@@ -4727,7 +5446,7 @@
           <w:i w:val="0"/>
           <w:sz w:val="22"/>
         </w:rPr>
-        <w:t>Para OR = 0,699:  E = 2,21</w:t>
+        <w:t>Para OR = 0,814:  E = 1,46</w:t>
       </w:r>
     </w:p>
     <w:p>
@@ -4810,7 +5529,7 @@
           <w:i w:val="0"/>
           <w:sz w:val="21"/>
         </w:rPr>
-        <w:t>Não, e o trabalho não afirma que seja. O que se estima é associação condicional sob seleção em observáveis. A seção de limitações lista as sete hipóteses uma a uma e o que acontece se cada uma falhar. O que sustenta o diagnóstico é a convergência de quatro métodos e a magnitude: seria preciso 99,0% de viés, ou um confundidor com OR de 2,2, para anular o resultado.</w:t>
+        <w:t>Não, e o trabalho não afirma que seja. O que se estima é associação condicional sob seleção em observáveis. A seção de limitações lista as sete hipóteses uma a uma e o que acontece se cada uma falhar. O que sustenta o diagnóstico é a convergência de quatro métodos e a magnitude: seria preciso 98,4% de viés, ou um confundidor com OR de 1,5, para anular o resultado.</w:t>
       </w:r>
     </w:p>
     <w:p>
@@ -4860,7 +5579,7 @@
           <w:i w:val="0"/>
           <w:sz w:val="21"/>
         </w:rPr>
-        <w:t>É, e é por isso que as duas versões são reportadas lado a lado. Ocupação, formalidade e horas são desfechos da própria discriminação: incluí-las (M4, especificação B da Oaxaca-Blinder) dá 7,0% — um limite inferior descritivo, a discriminação dentro da ocupação. Sem elas (M3, especificação A) o gap é 10,2%. A comparação com a literatura é feita sempre na mesma especificação.</w:t>
+        <w:t>É, e é por isso que as duas versões são reportadas lado a lado. Ocupação e formalidade são desfechos da própria discriminação: incluí-las (M4, especificação B da Oaxaca-Blinder) dá 5,6% — um limite inferior descritivo, a discriminação dentro da ocupação. Sem elas (M3, especificação A) o gap é 6,1%. A comparação com a literatura é feita sempre na mesma especificação.</w:t>
       </w:r>
     </w:p>
     <w:p>
@@ -4910,7 +5629,7 @@
           <w:i w:val="0"/>
           <w:sz w:val="21"/>
         </w:rPr>
-        <w:t>É — e por isso ela foi removida dos modelos de acesso e, no XGBoost, substituída pela média leave-one-out, que exclui o próprio indivíduo. O R² cai pouco e a contribuição SHAP da raça fica praticamente idêntica (0,0314 contra 0,0307 sem a variável). Ainda assim, choques comuns ao bairro impedem leitura causal do coeficiente contextual, e isso está dito nas limitações.</w:t>
+        <w:t>É — e por isso ela foi removida dos modelos de acesso e, no XGBoost, substituída pela média leave-one-out, que exclui o próprio indivíduo. O R² cai pouco e a contribuição SHAP da raça fica praticamente idêntica (0,0266 contra 0,0295 sem a variável). Ainda assim, choques comuns ao bairro impedem leitura causal do coeficiente contextual, e isso está dito nas limitações.</w:t>
       </w:r>
     </w:p>
     <w:p>
@@ -5010,7 +5729,7 @@
           <w:i w:val="0"/>
           <w:sz w:val="21"/>
         </w:rPr>
-        <w:t>As estimativas principais são não ponderadas e isso está declarado: elas descrevem a regressão na amostra, não a média populacional. Como robustez, o modelo-chave foi reestimado com o peso V1028 e o gap muda menos de meio ponto percentual. Em regressão com os estratos do desenho entre os controles, ponderar altera pouco os coeficientes e infla a variância.</w:t>
+        <w:t>As estimativas principais são não ponderadas e isso está declarado: elas descrevem a regressão na amostra, não a média populacional. Como robustez, o modelo-chave foi reestimado com o peso V1028 e o gap muda cerca de meio ponto percentual. Em regressão com os estratos do desenho entre os controles, ponderar altera pouco os coeficientes e infla a variância.</w:t>
       </w:r>
     </w:p>
     <w:p>
@@ -5060,7 +5779,7 @@
           <w:i w:val="0"/>
           <w:sz w:val="21"/>
         </w:rPr>
-        <w:t>Fica — e é por isso que a leitura privilegia magnitude, intervalos de confiança e E-values, não asteriscos. Um exemplo no próprio trabalho: a tendência temporal do gap, com esse N, tem p = 0,077 e não se distingue de zero; a conclusão conservadora é que a década não produziu convergência mensurável.</w:t>
+        <w:t>Fica — e é por isso que a leitura privilegia magnitude, intervalos de confiança e E-values, não asteriscos. Um exemplo no próprio trabalho: a tendência temporal do gap tem p = 0,027, significante e lenta: 0,0009 log-ponto por ano — a convergência existe, mas no ritmo da década levaria gerações.</w:t>
       </w:r>
     </w:p>
     <w:p>
@@ -5110,7 +5829,7 @@
           <w:i w:val="0"/>
           <w:sz w:val="21"/>
         </w:rPr>
-        <w:t>Porque 27 unidades são poucas para estimar uma distribuição no terceiro nível, e 26 dummies absorvem todo o contexto estadual sem hipótese distribucional. A hipótese em teste é sobre o bairro, que tem 40.969 unidades. Como contraprova, todos os coeficientes foram reestimados com efeitos fixos de UF e erro agrupado por UPA, com as mesmas conclusões.</w:t>
+        <w:t>Porque 27 unidades são poucas para estimar uma distribuição no terceiro nível, e 26 dummies absorvem todo o contexto estadual sem hipótese distribucional. A hipótese em teste é sobre o bairro, que tem 41.454 unidades. Como contraprova, todos os coeficientes foram reestimados com efeitos fixos de UF e erro agrupado por UPA, com as mesmas conclusões.</w:t>
       </w:r>
     </w:p>
     <w:p>
@@ -5160,7 +5879,7 @@
           <w:i w:val="0"/>
           <w:sz w:val="21"/>
         </w:rPr>
-        <w:t>É condicionar no desfecho, sim. A direção provável do viés é de subestimação: se os trabalhadores negros que permanecem ocupados são positivamente selecionados em atributos não observados, o gap entre observados é menor que o gap potencial. O modelo logístico de acesso trata diretamente a outra metade do problema, e a correção de Heckman, estimada na versão estendida, indicou seleção não nula com o coeficiente racial estável em sinal e ordem de grandeza.</w:t>
+        <w:t>É condicionar no desfecho, sim. A direção provável do viés é de subestimação: se os trabalhadores negros que permanecem ocupados são positivamente selecionados em atributos não observados, o gap entre observados é menor que o gap potencial. O modelo logístico de acesso trata diretamente a outra metade do problema. Uma correção à Heckman exigiria uma variável de exclusão crível — algo que mude a chance de estar ocupado sem mudar o salário — e fica como extensão; por isso o gap reportado é o gap entre ocupados.</w:t>
       </w:r>
     </w:p>
     <w:p>
@@ -5184,7 +5903,7 @@
           <w:i w:val="0"/>
           <w:sz w:val="22"/>
         </w:rPr>
-        <w:t>OR de 0,699 quer dizer 30% menos probabilidade?</w:t>
+        <w:t>OR de 0,814 quer dizer 19% menos probabilidade?</w:t>
       </w:r>
     </w:p>
     <w:p>
@@ -5210,7 +5929,7 @@
           <w:i w:val="0"/>
           <w:sz w:val="21"/>
         </w:rPr>
-        <w:t>Não: quer dizer 30% menos chance, no sentido de odds. Em probabilidade, o efeito marginal médio é de 5,5 pontos percentuais. Os dois números estão na tabela justamente para essa pergunta.</w:t>
+        <w:t>Não: quer dizer 19% menos chance, no sentido de odds. Em probabilidade, o efeito marginal médio é de 2,6 pontos percentuais. Os dois números estão na tabela justamente para essa pergunta.</w:t>
       </w:r>
     </w:p>
     <w:p>
@@ -5260,7 +5979,7 @@
           <w:i w:val="0"/>
           <w:sz w:val="21"/>
         </w:rPr>
-        <w:t>Ele não estima efeito nenhum — tem função de contraprova. Se a penalidade racial fosse artefato da forma funcional linear imposta pelo HLM, um modelo sem essa imposição não daria peso à variável de raça. Dá: 11ª posição entre 29 preditores. É convergência entre dois regimes epistemológicos diferentes — um inferencial, outro preditivo.</w:t>
+        <w:t>Ele não estima efeito nenhum — tem função de contraprova. Se a penalidade racial fosse artefato da forma funcional linear imposta pelo HLM, um modelo sem essa imposição não daria peso à variável de raça. Dá: 14ª posição entre 28 preditores. É convergência entre dois regimes epistemológicos diferentes — um inferencial, outro preditivo.</w:t>
       </w:r>
     </w:p>
     <w:p>
@@ -5310,7 +6029,7 @@
           <w:i w:val="0"/>
           <w:sz w:val="21"/>
         </w:rPr>
-        <w:t>Três evidências: o gap entre R² de treino e de teste é 0,0090; N é muitas ordens de grandeza maior que a complexidade do modelo regularizado; e o R² de teste é estável entre a validação cruzada de 5 folds (0,628 ± 0,0007) e a partição única. Ampliar a base de amostral para populacional reduz, não aumenta, o risco de sobreajuste.</w:t>
+        <w:t>Três evidências: o gap entre R² de treino e de teste é 0,0084; N é muitas ordens de grandeza maior que a complexidade do modelo regularizado; e o R² de teste é estável entre a validação cruzada de 5 folds (0,644 ± 0,0006) e a partição única. Ampliar a base de amostral para populacional reduz, não aumenta, o risco de sobreajuste.</w:t>
       </w:r>
     </w:p>
     <w:p>
@@ -5410,7 +6129,57 @@
           <w:i w:val="0"/>
           <w:sz w:val="21"/>
         </w:rPr>
-        <w:t>Nem uma nem outra, e é esse o achado: a penalidade dela (80,6% vs. o homem branco) é maior que a soma das penalidades isoladas de raça e de gênero, mas por 4,6 pontos percentuais, não pelo dobro. A interação é sub-aditiva: existe efeito interseccional puro, e ele é menor do que a leitura mais dramática sugeriria. Dizer o número exato é mais forte que dizer “dupla discriminação”.</w:t>
+        <w:t>Dupla, no sentido de que acumula as duas — não tripla. A mulher negra teve o maior gap (80,7% contra o homem branco), mas suas desvantagens de raça e de gênero se acumularam sem se multiplicar: em log-pontos, o gap dela (0,592) ficou abaixo da soma das penalidades isoladas (0,629). A interação negro × mulher do GLMM também é sub-aditiva. Dizer o número exato é mais forte que dizer “dupla discriminação”, e evita a armadilha de somar percentuais.</w:t>
+      </w:r>
+    </w:p>
+    <w:p>
+      <w:pPr>
+        <w:spacing w:before="160" w:after="40"/>
+      </w:pPr>
+      <w:r>
+        <w:rPr>
+          <w:rFonts w:ascii="Calibri" w:hAnsi="Calibri"/>
+          <w:b/>
+          <w:i w:val="0"/>
+          <w:color w:val="B71C1C"/>
+          <w:sz w:val="22"/>
+        </w:rPr>
+        <w:t xml:space="preserve">P. </w:t>
+      </w:r>
+      <w:r>
+        <w:rPr>
+          <w:rFonts w:ascii="Calibri" w:hAnsi="Calibri"/>
+          <w:b/>
+          <w:i w:val="0"/>
+          <w:sz w:val="22"/>
+        </w:rPr>
+        <w:t>O que é a UPA? Esse “bairro” foi um recorte criado por vocês?</w:t>
+      </w:r>
+    </w:p>
+    <w:p>
+      <w:pPr>
+        <w:spacing w:after="80"/>
+        <w:ind w:left="340"/>
+        <w:jc w:val="both"/>
+      </w:pPr>
+      <w:r>
+        <w:rPr>
+          <w:rFonts w:ascii="Calibri" w:hAnsi="Calibri"/>
+          <w:b/>
+          <w:i w:val="0"/>
+          <w:color w:val="1565C0"/>
+          <w:sz w:val="21"/>
+        </w:rPr>
+        <w:t xml:space="preserve">R. </w:t>
+      </w:r>
+      <w:r>
+        <w:rPr>
+          <w:rFonts w:ascii="Calibri" w:hAnsi="Calibri"/>
+          <w:b w:val="0"/>
+          <w:i w:val="0"/>
+          <w:sz w:val="21"/>
+        </w:rPr>
+        <w:t>Não. A UPA — Unidade Primária de Amostragem — é do desenho da própria PNAD Contínua: em cada estrato, o IBGE sorteia setores censitários (ou pequenos conjuntos de setores vizinhos, quando o setor tem poucos domicílios) e, dentro de cada um, um grupo de domicílios entrevistado em cinco trimestres seguidos. O código vem no microdado público (variável UPA). Chamo de bairro porque é a menor unidade territorial que a PNAD identifica — algumas centenas de domicílios vizinhos. A correspondência é aproximada: em cidade grande, um bairro administrativo contém várias UPAs; na zona rural, uma UPA pode ser extensa. Por isso, nas equações e nos erros-padrão, o texto diz UPA.</w:t>
       </w:r>
     </w:p>
     <w:p>
@@ -5460,7 +6229,7 @@
           <w:i w:val="0"/>
           <w:sz w:val="21"/>
         </w:rPr>
-        <w:t>O desenho transversal. Não se observa a mesma pessoa ao longo do tempo, então nada aqui identifica trajetória individual — só diferenças entre pessoas comparáveis num dado momento. A segunda é a cobertura da escolaridade detalhada, registrada para cerca de 31% da PEA no painel público; por isso os níveis entram como dummies de conclusão com indicador explícito de não-registro, e os retornos educacionais são lidos com cautela.</w:t>
+        <w:t>O desenho transversal. Não se observa a mesma pessoa ao longo do tempo, então nada aqui identifica trajetória individual — só diferenças entre pessoas comparáveis num dado momento. A segunda é que ocupação e vínculo são, eles próprios, desfechos do processo estudado (a jornada só o é no modelo de acesso): controlá-los (M4, A3) dá um limite inferior descritivo, não o efeito líquido da raça.</w:t>
       </w:r>
     </w:p>
     <w:p>
@@ -5493,7 +6262,7 @@
           <w:i w:val="0"/>
           <w:sz w:val="22"/>
         </w:rPr>
-        <w:t>Sei dizer de cor: 19,1% agregado → 47,0% mediado pelo bairro → 10,2% líquido → 7,0% dentro da ocupação.</w:t>
+        <w:t>Sei dizer de cor: 10,5% agregado → 39,5% mediado pelo bairro → 6,1% líquido → 5,6% dentro da ocupação.</w:t>
       </w:r>
     </w:p>
     <w:p>
@@ -5509,7 +6278,7 @@
           <w:i w:val="0"/>
           <w:sz w:val="22"/>
         </w:rPr>
-        <w:t>Sei dizer de cor: OR 0,699 no acesso e 0,654 no topo 10%.</w:t>
+        <w:t>Sei dizer de cor: OR 0,814 no acesso e 0,761 no topo 10%.</w:t>
       </w:r>
     </w:p>
     <w:p>
@@ -5525,7 +6294,7 @@
           <w:i w:val="0"/>
           <w:sz w:val="22"/>
         </w:rPr>
-        <w:t>Sei dizer de cor: ICC 0,369 — 37% da variância é entre bairros.</w:t>
+        <w:t>Sei dizer de cor: ICC 0,353 — 35% da variância é entre bairros.</w:t>
       </w:r>
     </w:p>
     <w:p>
@@ -5615,6 +6384,7 @@
       </w:r>
     </w:p>
     <w:sectPr>
+      <w:footerReference w:type="default" r:id="rId16"/>
       <w:pgSz w:w="12240" w:h="15840"/>
       <w:pgMar w:top="1134" w:right="1247" w:bottom="1134" w:left="1247" w:header="720" w:footer="720" w:gutter="0"/>
       <w:cols w:space="720"/>
@@ -5622,6 +6392,29 @@
     </w:sectPr>
   </w:body>
 </w:document>
+</file>
+
+<file path=word/footer1.xml><?xml version="1.0" encoding="utf-8"?>
+<w:ftr xmlns:m="http://schemas.openxmlformats.org/officeDocument/2006/math" xmlns:mc="http://schemas.openxmlformats.org/markup-compatibility/2006" xmlns:mo="http://schemas.microsoft.com/office/mac/office/2008/main" xmlns:mv="urn:schemas-microsoft-com:mac:vml" xmlns:o="urn:schemas-microsoft-com:office:office" xmlns:r="http://schemas.openxmlformats.org/officeDocument/2006/relationships" xmlns:v="urn:schemas-microsoft-com:vml" xmlns:w10="urn:schemas-microsoft-com:office:word" xmlns:w14="http://schemas.microsoft.com/office/word/2010/wordml" xmlns:w="http://schemas.openxmlformats.org/wordprocessingml/2006/main" xmlns:wne="http://schemas.microsoft.com/office/word/2006/wordml" xmlns:wp14="http://schemas.microsoft.com/office/word/2010/wordprocessingDrawing" xmlns:wp="http://schemas.openxmlformats.org/drawingml/2006/wordprocessingDrawing" xmlns:wpc="http://schemas.microsoft.com/office/word/2010/wordprocessingCanvas" xmlns:wpg="http://schemas.microsoft.com/office/word/2010/wordprocessingGroup" xmlns:wpi="http://schemas.microsoft.com/office/word/2010/wordprocessingInk" xmlns:wps="http://schemas.microsoft.com/office/word/2010/wordprocessingShape" mc:Ignorable="w14 wp14">
+  <w:p>
+    <w:pPr>
+      <w:pStyle w:val="Footer"/>
+      <w:jc w:val="center"/>
+    </w:pPr>
+    <w:r>
+      <w:rPr>
+        <w:rFonts w:ascii="Calibri" w:hAnsi="Calibri"/>
+        <w:b w:val="0"/>
+        <w:i w:val="0"/>
+        <w:color w:val="616161"/>
+        <w:sz w:val="18"/>
+      </w:rPr>
+      <w:fldChar w:fldCharType="begin"/>
+      <w:instrText xml:space="preserve">PAGE</w:instrText>
+      <w:fldChar w:fldCharType="end"/>
+    </w:r>
+  </w:p>
+</w:ftr>
 </file>
 
 <file path=word/numbering.xml><?xml version="1.0" encoding="utf-8"?>

</xml_diff>

<commit_message>
data(resultados): robustez ao peso amostral e heterogeneidade (04/10/2026)
Peso V1028 (logit A2, erro agrupado por UPA): OR do acesso 0,820 → 0,808;
top 10% 0,758 → 0,777. Oaxaca (A): preço 17,9% → 15,3%.
Baseline do ML (R² de teste): MQO 0,587; RF 0,589; XGBoost 0,644.

Heterogeneidade (mesmo perfil e bairro, contra brancos):
- Cor: penalidade salarial pardos 5,8% e pretos 7,4%; acesso OR 0,820 e 0,785;
  top 10% 0,768 e 0,725; QR q95 9,5% e 11,6%.
- Setor: acesso igual (0,783 privado, 0,786 público); top 10% 0,685 e 0,843;
  salário 7,2% e 4,6%.
- Idade: penalidade de 1,7% (14–29) a 14,7% (65+).
- Top 10% dentro da UF: OR 0,762 (corte nacional 0,761).

Entregáveis regenerados às 17:40 com todos os portões OK (norma 27/27, Word com
48 páginas, caca_fosseis 0, conferir_numeros 0, validate consistente).

Co-Authored-By: Claude Opus 5.5 (1M context) <noreply@anthropic.com>
Claude-Session: https://claude.ai/code/session_01ATPBca6o9jxRv5wGBtSSkf
</commit_message>
<xml_diff>
--- a/entregaveis/TCC_Ricardo_Calheiros_Guia_de_Estudo.docx
+++ b/entregaveis/TCC_Ricardo_Calheiros_Guia_de_Estudo.docx
@@ -4931,6 +4931,82 @@
       </w:r>
     </w:p>
     <w:p>
+      <w:pPr>
+        <w:pStyle w:val="Heading2"/>
+      </w:pPr>
+      <w:r>
+        <w:rPr>
+          <w:rFonts w:ascii="Calibri" w:hAnsi="Calibri"/>
+          <w:color w:val="1F3864"/>
+        </w:rPr>
+        <w:t>4.6  O que o agregado esconde: cor, setor e idade</w:t>
+      </w:r>
+    </w:p>
+    <w:p>
+      <w:pPr>
+        <w:pStyle w:val="ListBullet"/>
+        <w:spacing w:after="60"/>
+        <w:ind w:left="340"/>
+      </w:pPr>
+      <w:r>
+        <w:rPr>
+          <w:rFonts w:ascii="Calibri" w:hAnsi="Calibri"/>
+          <w:b w:val="0"/>
+          <w:i w:val="0"/>
+          <w:sz w:val="22"/>
+        </w:rPr>
+        <w:t>Pretos × pardos (mesmo perfil e bairro): salário 7,4% × 5,8%; acesso OR 0,785 × 0,820; top 10% OR 0,725 × 0,768. A distância cresce no topo (QR q95: 11,6% × 9,5%). Leitura: compatível com colorismo; 'negro' segue como categoria da política, porque os dois grupos estão abaixo dos brancos em tudo.</w:t>
+      </w:r>
+    </w:p>
+    <w:p>
+      <w:pPr>
+        <w:pStyle w:val="ListBullet"/>
+        <w:spacing w:after="60"/>
+        <w:ind w:left="340"/>
+      </w:pPr>
+      <w:r>
+        <w:rPr>
+          <w:rFonts w:ascii="Calibri" w:hAnsi="Calibri"/>
+          <w:b w:val="0"/>
+          <w:i w:val="0"/>
+          <w:sz w:val="22"/>
+        </w:rPr>
+        <w:t>Setor: a porta é igual (acesso OR 0,783 no privado × 0,786 no público); o teto não (top 10% 0,685 × 0,843; salário 7,2% × 4,6%).</w:t>
+      </w:r>
+    </w:p>
+    <w:p>
+      <w:pPr>
+        <w:pStyle w:val="ListBullet"/>
+        <w:spacing w:after="60"/>
+        <w:ind w:left="340"/>
+      </w:pPr>
+      <w:r>
+        <w:rPr>
+          <w:rFonts w:ascii="Calibri" w:hAnsi="Calibri"/>
+          <w:b w:val="0"/>
+          <w:i w:val="0"/>
+          <w:sz w:val="22"/>
+        </w:rPr>
+        <w:t>Idade: 1,7% (14–29) a 14,7% (65+). Pergunta provável: 'é coorte ou ciclo de vida?' — resposta: dado transversal não separa; as duas leituras são compatíveis com o teto de vidro.</w:t>
+      </w:r>
+    </w:p>
+    <w:p>
+      <w:pPr>
+        <w:pStyle w:val="ListBullet"/>
+        <w:spacing w:after="60"/>
+        <w:ind w:left="340"/>
+      </w:pPr>
+      <w:r>
+        <w:rPr>
+          <w:rFonts w:ascii="Calibri" w:hAnsi="Calibri"/>
+          <w:b w:val="0"/>
+          <w:i w:val="0"/>
+          <w:sz w:val="22"/>
+        </w:rPr>
+        <w:t>Teto de vidro dentro de cada UF: OR 0,762 — não é efeito da geografia. Peso amostral (V1028): OR do acesso 0,820 → 0,808. WeMix: inviável com 41 mil UPAs.</w:t>
+      </w:r>
+    </w:p>
+    <w:p>
       <w:r>
         <w:br w:type="page"/>
       </w:r>

</xml_diff>

<commit_message>
data(resultados): entregáveis regenerados após a releitura E8.7 (04/10/2026)
Norma 27/27, Word 49 páginas, fósseis 0, números sem fonte 0, verificar_analises 0 ALTO.

Co-Authored-By: Claude Opus 5.5 (1M context) <noreply@anthropic.com>
Claude-Session: https://claude.ai/code/session_01ATPBca6o9jxRv5wGBtSSkf
</commit_message>
<xml_diff>
--- a/entregaveis/TCC_Ricardo_Calheiros_Guia_de_Estudo.docx
+++ b/entregaveis/TCC_Ricardo_Calheiros_Guia_de_Estudo.docx
@@ -4955,7 +4955,7 @@
           <w:i w:val="0"/>
           <w:sz w:val="22"/>
         </w:rPr>
-        <w:t>Pretos × pardos (mesmo perfil e bairro): salário 7,4% × 5,8%; acesso OR 0,785 × 0,820; top 10% OR 0,725 × 0,768. A distância cresce no topo (QR q95: 11,6% × 9,5%). Leitura: compatível com colorismo; 'negro' segue como categoria da política, porque os dois grupos estão abaixo dos brancos em tudo.</w:t>
+        <w:t>Pretos × pardos (mesmo perfil e bairro): salário 7,4% × 5,8%; acesso OR 0,785 × 0,820; top 10% OR 0,725 × 0,768. A distância cresce no topo (QR, 9º decil: 10,0% × 8,0%). Leitura: compatível com colorismo (discriminação graduada pela tonalidade da pele, Telles 2004); 'negro' segue como categoria da política, porque os dois grupos estão abaixo dos brancos em todas as medidas.</w:t>
       </w:r>
     </w:p>
     <w:p>
@@ -4971,7 +4971,7 @@
           <w:i w:val="0"/>
           <w:sz w:val="22"/>
         </w:rPr>
-        <w:t>Setor: a porta é igual (acesso OR 0,783 no privado × 0,786 no público); o teto não (top 10% 0,685 × 0,843; salário 7,2% × 4,6%).</w:t>
+        <w:t>Setor: a porta é igualmente desigual (acesso OR 0,783 no privado × 0,786 no público); o teto não (top 10% 0,685 × 0,843; salário 7,2% × 4,6%).</w:t>
       </w:r>
     </w:p>
     <w:p>
@@ -4987,7 +4987,7 @@
           <w:i w:val="0"/>
           <w:sz w:val="22"/>
         </w:rPr>
-        <w:t>Idade: 1,7% (14–29) a 14,7% (65+). Pergunta provável: 'é coorte ou ciclo de vida?' — resposta: dado transversal não separa; as duas leituras são compatíveis com o teto de vidro.</w:t>
+        <w:t>Idade: 1,7% (14–29) a 14,7% (65+). Pergunta provável: 'é coorte ou ciclo de vida?' — resposta: dado transversal não separa; ciclo de vida é compatível com o teto de vidro, coorte com melhora entre gerações; 65+ é grupo selecionado (só quem ainda trabalha).</w:t>
       </w:r>
     </w:p>
     <w:p>
@@ -5003,7 +5003,7 @@
           <w:i w:val="0"/>
           <w:sz w:val="22"/>
         </w:rPr>
-        <w:t>Teto de vidro dentro de cada UF: OR 0,762 — não é efeito da geografia. Peso amostral (V1028): OR do acesso 0,820 → 0,808. WeMix: inviável com 41 mil UPAs.</w:t>
+        <w:t>Teto de vidro dentro de cada UF: OR 0,762 — não decorre da composição regional dos salários. Peso amostral (V1028), no logit com efeito fixo de estado: OR do acesso 0,820 → 0,808. WeMix (pacote R de multinível ponderado): inviável com 41 mil UPAs.</w:t>
       </w:r>
     </w:p>
     <w:p>

</xml_diff>

<commit_message>
data(resultados): estudo de evento da COVID e entregáveis regenerados (04/10/2026)
Penalidade (FE de bairro) 7,0% em 2019, 5,9% em 2020, 5,2% em 2025; sem pré-tendência
(p 0,75); desvio de 2020 +1,0 log-pt (p 0,004); ocupação dos negros dentro da tendência.
Norma 27/27, Word 49 páginas, fósseis 0, sem fonte 0, verificar_analises 0 ALTO.

Co-Authored-By: Claude Opus 5.5 (1M context) <noreply@anthropic.com>
Claude-Session: https://claude.ai/code/session_01ATPBca6o9jxRv5wGBtSSkf
</commit_message>
<xml_diff>
--- a/entregaveis/TCC_Ricardo_Calheiros_Guia_de_Estudo.docx
+++ b/entregaveis/TCC_Ricardo_Calheiros_Guia_de_Estudo.docx
@@ -5855,7 +5855,57 @@
           <w:i w:val="0"/>
           <w:sz w:val="21"/>
         </w:rPr>
-        <w:t>Fica — e é por isso que a leitura privilegia magnitude, intervalos de confiança e E-values, não asteriscos. Um exemplo no próprio trabalho: a tendência temporal do gap tem p = 0,027, significante e lenta: 0,0009 log-ponto por ano — a convergência existe, mas no ritmo da década levaria gerações.</w:t>
+        <w:t>Fica — e é por isso que a leitura privilegia magnitude, intervalos de confiança e E-values, não asteriscos. Um exemplo no próprio trabalho: a tendência temporal do gap tem p = 0,027, significante: 0,0009 log-ponto por ano. Mas o estudo de evento mostra que não é um ritmo: a penalidade oscilou sem tendência até 2019, caiu em 2020 (7,0% → 5,9%, com efeito fixo de bairro) e não voltou ao nível anterior (5,2% em 2025) — um degrau, não uma rampa a extrapolar.</w:t>
+      </w:r>
+    </w:p>
+    <w:p>
+      <w:pPr>
+        <w:spacing w:before="160" w:after="40"/>
+      </w:pPr>
+      <w:r>
+        <w:rPr>
+          <w:rFonts w:ascii="Calibri" w:hAnsi="Calibri"/>
+          <w:b/>
+          <w:i w:val="0"/>
+          <w:color w:val="B71C1C"/>
+          <w:sz w:val="22"/>
+        </w:rPr>
+        <w:t xml:space="preserve">P. </w:t>
+      </w:r>
+      <w:r>
+        <w:rPr>
+          <w:rFonts w:ascii="Calibri" w:hAnsi="Calibri"/>
+          <w:b/>
+          <w:i w:val="0"/>
+          <w:sz w:val="22"/>
+        </w:rPr>
+        <w:t>E a quebra de 2020? A pandemia não contamina a série?</w:t>
+      </w:r>
+    </w:p>
+    <w:p>
+      <w:pPr>
+        <w:spacing w:after="80"/>
+        <w:ind w:left="340"/>
+        <w:jc w:val="both"/>
+      </w:pPr>
+      <w:r>
+        <w:rPr>
+          <w:rFonts w:ascii="Calibri" w:hAnsi="Calibri"/>
+          <w:b/>
+          <w:i w:val="0"/>
+          <w:color w:val="1565C0"/>
+          <w:sz w:val="21"/>
+        </w:rPr>
+        <w:t xml:space="preserve">R. </w:t>
+      </w:r>
+      <w:r>
+        <w:rPr>
+          <w:rFonts w:ascii="Calibri" w:hAnsi="Calibri"/>
+          <w:b w:val="0"/>
+          <w:i w:val="0"/>
+          <w:sz w:val="21"/>
+        </w:rPr>
+        <w:t>Testado com um estudo de evento (base 2019, efeito fixo de bairro, erro por UPA). A penalidade caiu de 7,0% para 5,9% em 2020 (1,0 log-ponto acima da tendência, p = 0,004) e não voltou (5,2% em 2025). Não é seleção: a ocupação dos negros caiu só 0,26 p.p. a mais em 2020, dentro da tendência, e cresceu mais que a dos brancos desde 2022. Não é a entrevista por telefone: persiste após a volta da coleta presencial. Sem grupo de controle, não se identifica a causa; os resultados agrupados de 2016–2025 são uma média de antes e depois do degrau.</w:t>
       </w:r>
     </w:p>
     <w:p>

</xml_diff>

<commit_message>
data(resultados): entregáveis conforme o Relatório de Formatação (06/10/2026)
Norma 31/31, Word 49 páginas, fósseis 0, números sem fonte 0, validate consistente.

Co-Authored-By: Claude Opus 5.5 (1M context) <noreply@anthropic.com>
Claude-Session: https://claude.ai/code/session_01ATPBca6o9jxRv5wGBtSSkf
</commit_message>
<xml_diff>
--- a/entregaveis/TCC_Ricardo_Calheiros_Guia_de_Estudo.docx
+++ b/entregaveis/TCC_Ricardo_Calheiros_Guia_de_Estudo.docx
@@ -2001,7 +2001,7 @@
       <w:r>
         <w:drawing>
           <wp:inline xmlns:a="http://schemas.openxmlformats.org/drawingml/2006/main" xmlns:pic="http://schemas.openxmlformats.org/drawingml/2006/picture">
-            <wp:extent cx="5580000" cy="2711298"/>
+            <wp:extent cx="5580000" cy="2202632"/>
             <wp:docPr id="1" name="Picture 1"/>
             <wp:cNvGraphicFramePr>
               <a:graphicFrameLocks noChangeAspect="1"/>
@@ -2022,7 +2022,7 @@
                   <pic:spPr>
                     <a:xfrm>
                       <a:off x="0" y="0"/>
-                      <a:ext cx="5580000" cy="2711298"/>
+                      <a:ext cx="5580000" cy="2202632"/>
                     </a:xfrm>
                     <a:prstGeom prst="rect"/>
                   </pic:spPr>
@@ -2056,7 +2056,7 @@
       <w:r>
         <w:drawing>
           <wp:inline xmlns:a="http://schemas.openxmlformats.org/drawingml/2006/main" xmlns:pic="http://schemas.openxmlformats.org/drawingml/2006/picture">
-            <wp:extent cx="5400000" cy="2415471"/>
+            <wp:extent cx="5400000" cy="2370067"/>
             <wp:docPr id="2" name="Picture 2"/>
             <wp:cNvGraphicFramePr>
               <a:graphicFrameLocks noChangeAspect="1"/>
@@ -2077,7 +2077,7 @@
                   <pic:spPr>
                     <a:xfrm>
                       <a:off x="0" y="0"/>
-                      <a:ext cx="5400000" cy="2415471"/>
+                      <a:ext cx="5400000" cy="2370067"/>
                     </a:xfrm>
                     <a:prstGeom prst="rect"/>
                   </pic:spPr>
@@ -2506,7 +2506,7 @@
       <w:r>
         <w:drawing>
           <wp:inline xmlns:a="http://schemas.openxmlformats.org/drawingml/2006/main" xmlns:pic="http://schemas.openxmlformats.org/drawingml/2006/picture">
-            <wp:extent cx="5580000" cy="2242207"/>
+            <wp:extent cx="5580000" cy="1749057"/>
             <wp:docPr id="3" name="Picture 3"/>
             <wp:cNvGraphicFramePr>
               <a:graphicFrameLocks noChangeAspect="1"/>
@@ -2527,7 +2527,7 @@
                   <pic:spPr>
                     <a:xfrm>
                       <a:off x="0" y="0"/>
-                      <a:ext cx="5580000" cy="2242207"/>
+                      <a:ext cx="5580000" cy="1749057"/>
                     </a:xfrm>
                     <a:prstGeom prst="rect"/>
                   </pic:spPr>
@@ -3066,7 +3066,7 @@
       <w:r>
         <w:drawing>
           <wp:inline xmlns:a="http://schemas.openxmlformats.org/drawingml/2006/main" xmlns:pic="http://schemas.openxmlformats.org/drawingml/2006/picture">
-            <wp:extent cx="5580000" cy="2017259"/>
+            <wp:extent cx="5580000" cy="1616208"/>
             <wp:docPr id="4" name="Picture 4"/>
             <wp:cNvGraphicFramePr>
               <a:graphicFrameLocks noChangeAspect="1"/>
@@ -3087,7 +3087,7 @@
                   <pic:spPr>
                     <a:xfrm>
                       <a:off x="0" y="0"/>
-                      <a:ext cx="5580000" cy="2017259"/>
+                      <a:ext cx="5580000" cy="1616208"/>
                     </a:xfrm>
                     <a:prstGeom prst="rect"/>
                   </pic:spPr>
@@ -3715,7 +3715,7 @@
       <w:r>
         <w:drawing>
           <wp:inline xmlns:a="http://schemas.openxmlformats.org/drawingml/2006/main" xmlns:pic="http://schemas.openxmlformats.org/drawingml/2006/picture">
-            <wp:extent cx="5580000" cy="2589309"/>
+            <wp:extent cx="5580000" cy="2034872"/>
             <wp:docPr id="5" name="Picture 5"/>
             <wp:cNvGraphicFramePr>
               <a:graphicFrameLocks noChangeAspect="1"/>
@@ -3736,7 +3736,7 @@
                   <pic:spPr>
                     <a:xfrm>
                       <a:off x="0" y="0"/>
-                      <a:ext cx="5580000" cy="2589309"/>
+                      <a:ext cx="5580000" cy="2034872"/>
                     </a:xfrm>
                     <a:prstGeom prst="rect"/>
                   </pic:spPr>

</xml_diff>

<commit_message>
data(resultados): entregáveis com o novo título (06/10/2026)
Norma 31/31, Word 49 páginas, fósseis 0, números sem fonte 0, validate consistente.

Co-Authored-By: Claude Opus 5.5 (1M context) <noreply@anthropic.com>
Claude-Session: https://claude.ai/code/session_01ATPBca6o9jxRv5wGBtSSkf
</commit_message>
<xml_diff>
--- a/entregaveis/TCC_Ricardo_Calheiros_Guia_de_Estudo.docx
+++ b/entregaveis/TCC_Ricardo_Calheiros_Guia_de_Estudo.docx
@@ -31,7 +31,7 @@
           <w:color w:val="616161"/>
           <w:sz w:val="26"/>
         </w:rPr>
-        <w:t>Racismo estrutural no mercado de trabalho brasileiro</w:t>
+        <w:t>Bairro, porta e topo: o racismo estrutural no mercado de trabalho brasileiro</w:t>
       </w:r>
     </w:p>
     <w:p>
@@ -47,7 +47,7 @@
           <w:color w:val="616161"/>
           <w:sz w:val="22"/>
         </w:rPr>
-        <w:t>Uma abordagem multinível e de decomposição salarial — PNAD Contínua 2016–2025</w:t>
+        <w:t>PNAD Contínua 2016–2025</w:t>
       </w:r>
     </w:p>
     <w:p>

</xml_diff>